<commit_message>
Added new boxplot in result
</commit_message>
<xml_diff>
--- a/source/Samples/NeocortexApiSamplePerformance/Documentation/ML-24-25-05 Implement Performance Measurement Experiment_PerfEX Project Report.docx
+++ b/source/Samples/NeocortexApiSamplePerformance/Documentation/ML-24-25-05 Implement Performance Measurement Experiment_PerfEX Project Report.docx
@@ -26,6 +26,17 @@
         </w:sectPr>
       </w:pPr>
       <w:bookmarkStart w:id="0" w:name="_Hlk155127776"/>
+      <w:r>
+        <w:rPr>
+          <w:rFonts w:eastAsia="MS Mincho"/>
+          <w:noProof w:val="0"/>
+          <w:kern w:val="48"/>
+          <w:sz w:val="48"/>
+          <w:szCs w:val="48"/>
+          <w:lang w:val="en-GB"/>
+        </w:rPr>
+        <w:t xml:space="preserve">ML-24-25-05 </w:t>
+      </w:r>
       <w:r>
         <w:rPr>
           <w:rFonts w:eastAsia="MS Mincho"/>
@@ -679,7 +690,27 @@
           <w:sz w:val="18"/>
           <w:szCs w:val="18"/>
         </w:rPr>
-        <w:t>performance diagrams are generated with the metrics to analyze the relationship between the hardware configurations software environments, and computational efficiency.</w:t>
+        <w:t xml:space="preserve">performance diagrams are generated with the metrics to </w:t>
+      </w:r>
+      <w:r>
+        <w:rPr>
+          <w:rFonts w:eastAsia="Times New Roman"/>
+          <w:b/>
+          <w:bCs/>
+          <w:sz w:val="18"/>
+          <w:szCs w:val="18"/>
+        </w:rPr>
+        <w:t>analyse</w:t>
+      </w:r>
+      <w:r>
+        <w:rPr>
+          <w:rFonts w:eastAsia="Times New Roman"/>
+          <w:b/>
+          <w:bCs/>
+          <w:sz w:val="18"/>
+          <w:szCs w:val="18"/>
+        </w:rPr>
+        <w:t xml:space="preserve"> the relationship between the hardware configurations software environments, and computational efficiency.</w:t>
       </w:r>
       <w:r>
         <w:rPr>
@@ -953,10 +984,10 @@
         <w:t>the process starts with</w:t>
       </w:r>
       <w:r>
-        <w:t xml:space="preserve"> Sparse Distributed Representations (SDRs), where input is converted to binary with a small percentage of active bits and the encoding maintains </w:t>
-      </w:r>
-      <w:r>
-        <w:t xml:space="preserve">semantic similarity which makes the model robust to noise letting it </w:t>
+        <w:t xml:space="preserve"> Sparse Distributed Representations </w:t>
+      </w:r>
+      <w:r>
+        <w:t xml:space="preserve">(SDRs), where input is converted to binary with a small percentage of active bits and the encoding maintains semantic similarity which makes the model robust to noise letting it </w:t>
       </w:r>
       <w:r>
         <w:t>identify</w:t>
@@ -1008,6 +1039,7 @@
       </w:pPr>
       <w:r>
         <w:rPr>
+          <w:noProof/>
           <w:lang w:eastAsia="en-CA"/>
         </w:rPr>
         <w:drawing>
@@ -1175,6 +1207,7 @@
           <w:noProof w:val="0"/>
           <w:color w:val="000000" w:themeColor="text1"/>
         </w:rPr>
+        <w:lastRenderedPageBreak/>
         <w:t xml:space="preserve">1.1.1. </w:t>
       </w:r>
       <w:r>
@@ -1192,11 +1225,7 @@
         <w:jc w:val="both"/>
       </w:pPr>
       <w:r>
-        <w:t xml:space="preserve">HTM is aimed at mirroring the brain's hierarchical structure as well as the learning process. HTM encompasses a </w:t>
-      </w:r>
-      <w:r>
-        <w:lastRenderedPageBreak/>
-        <w:t xml:space="preserve">hierarchically arranged network of nodes, each containing a group of neurotransmitters in the neocortex. Based on their prior experiences, these nodes learn to identify patterns in sensory input and foresee outcomes. The node's models are then </w:t>
+        <w:t xml:space="preserve">HTM is aimed at mirroring the brain's hierarchical structure as well as the learning process. HTM encompasses a hierarchically arranged network of nodes, each containing a group of neurotransmitters in the neocortex. Based on their prior experiences, these nodes learn to identify patterns in sensory input and foresee outcomes. The node's models are then </w:t>
       </w:r>
       <w:r>
         <w:t>adjusted,</w:t>
@@ -1241,6 +1270,7 @@
     <w:p>
       <w:r>
         <w:rPr>
+          <w:noProof/>
           <w:lang w:eastAsia="en-CA"/>
         </w:rPr>
         <w:drawing>
@@ -1328,444 +1358,8 @@
     </w:p>
     <w:p>
       <w:pPr>
-        <w:rPr>
-          <w:highlight w:val="red"/>
-        </w:rPr>
-      </w:pPr>
-    </w:p>
-    <w:p>
-      <w:pPr>
-        <w:autoSpaceDE w:val="0"/>
-        <w:autoSpaceDN w:val="0"/>
-        <w:adjustRightInd w:val="0"/>
-        <w:jc w:val="both"/>
-        <w:rPr>
-          <w:rStyle w:val="Emphasis"/>
-          <w:b/>
-          <w:bCs/>
-        </w:rPr>
-      </w:pPr>
-      <w:r>
-        <w:rPr>
-          <w:rStyle w:val="Emphasis"/>
-          <w:b/>
-          <w:bCs/>
-        </w:rPr>
-        <w:t>1.</w:t>
-      </w:r>
-      <w:r>
-        <w:rPr>
-          <w:rStyle w:val="Emphasis"/>
-          <w:b/>
-          <w:bCs/>
-        </w:rPr>
-        <w:t>1.</w:t>
-      </w:r>
-      <w:r>
-        <w:rPr>
-          <w:rStyle w:val="Emphasis"/>
-          <w:b/>
-          <w:bCs/>
-        </w:rPr>
-        <w:t>2</w:t>
-      </w:r>
-      <w:r>
-        <w:rPr>
-          <w:rStyle w:val="Emphasis"/>
-          <w:b/>
-          <w:bCs/>
-        </w:rPr>
-        <w:t>.   Proximal Dendrite Segments</w:t>
-      </w:r>
-    </w:p>
-    <w:p>
-      <w:pPr>
-        <w:jc w:val="both"/>
-        <w:rPr>
-          <w:rFonts w:eastAsia="Times New Roman"/>
-        </w:rPr>
-      </w:pPr>
-      <w:r>
-        <w:rPr>
-          <w:rFonts w:eastAsia="Times New Roman"/>
-        </w:rPr>
-        <w:t>Cells are joined in a column by a proximal dendrite, and synapses are shown by tiny black circles. A legitimate synaptic link with a persistence value higher than the connection threshold is shown by a solid circle. A putative synaptic connection with a persistence value below the connection threshold is represented by an empty circle. After a local inhibitory step, feedback input activates a column if there are sufficient genuine synapses linked to active input bits [14].</w:t>
-      </w:r>
-      <w:r>
-        <w:rPr>
-          <w:rFonts w:eastAsia="Times New Roman"/>
-        </w:rPr>
-        <w:t xml:space="preserve"> In Fig</w:t>
-      </w:r>
-      <w:r>
-        <w:rPr>
-          <w:rFonts w:eastAsia="Times New Roman"/>
-        </w:rPr>
-        <w:t xml:space="preserve">. </w:t>
-      </w:r>
-      <w:r>
-        <w:rPr>
-          <w:rFonts w:eastAsia="Times New Roman"/>
-        </w:rPr>
-        <w:t>1.1.2</w:t>
-      </w:r>
-      <w:r>
-        <w:rPr>
-          <w:rFonts w:eastAsia="Times New Roman"/>
-        </w:rPr>
-        <w:t>[9]</w:t>
-      </w:r>
-      <w:r>
-        <w:rPr>
-          <w:rFonts w:eastAsia="Times New Roman"/>
-        </w:rPr>
-        <w:t xml:space="preserve">, it shows the input integration mechanism of an HTM neuron, where it </w:t>
-      </w:r>
-      <w:r>
-        <w:rPr>
-          <w:rFonts w:eastAsia="Times New Roman"/>
-        </w:rPr>
-        <w:t>relates</w:t>
-      </w:r>
-      <w:r>
-        <w:rPr>
-          <w:rFonts w:eastAsia="Times New Roman"/>
-        </w:rPr>
-        <w:t xml:space="preserve"> feedforward input (Green), contextual input (blue), and feedback signals to </w:t>
-      </w:r>
-      <w:r>
-        <w:rPr>
-          <w:rFonts w:eastAsia="Times New Roman"/>
-        </w:rPr>
-        <w:t>decide</w:t>
-      </w:r>
-      <w:r>
-        <w:rPr>
-          <w:rFonts w:eastAsia="Times New Roman"/>
-        </w:rPr>
-        <w:t xml:space="preserve"> activation. </w:t>
-      </w:r>
-      <w:r>
-        <w:rPr>
-          <w:rFonts w:eastAsia="Times New Roman"/>
-        </w:rPr>
-        <w:t>Dendrite segments are represented by the OR gates that detect specific patterns for predictive or active states.</w:t>
-      </w:r>
-    </w:p>
-    <w:p>
-      <w:r>
-        <w:rPr>
-          <w:noProof/>
-        </w:rPr>
-        <w:drawing>
-          <wp:inline distT="0" distB="0" distL="0" distR="0" wp14:anchorId="1EA2577A" wp14:editId="6B8C93D9">
-            <wp:extent cx="960120" cy="1270113"/>
-            <wp:effectExtent l="0" t="0" r="0" b="6350"/>
-            <wp:docPr id="1690440360" name="Picture 3" descr="A diagram of a diagram&#10;&#10;AI-generated content may be incorrect."/>
-            <wp:cNvGraphicFramePr>
-              <a:graphicFrameLocks xmlns:a="http://schemas.openxmlformats.org/drawingml/2006/main" noChangeAspect="1"/>
-            </wp:cNvGraphicFramePr>
-            <a:graphic xmlns:a="http://schemas.openxmlformats.org/drawingml/2006/main">
-              <a:graphicData uri="http://schemas.openxmlformats.org/drawingml/2006/picture">
-                <pic:pic xmlns:pic="http://schemas.openxmlformats.org/drawingml/2006/picture">
-                  <pic:nvPicPr>
-                    <pic:cNvPr id="1690440360" name="Picture 3" descr="A diagram of a diagram&#10;&#10;AI-generated content may be incorrect."/>
-                    <pic:cNvPicPr>
-                      <a:picLocks noChangeAspect="1" noChangeArrowheads="1"/>
-                    </pic:cNvPicPr>
-                  </pic:nvPicPr>
-                  <pic:blipFill>
-                    <a:blip r:embed="rId14">
-                      <a:extLst>
-                        <a:ext uri="{28A0092B-C50C-407E-A947-70E740481C1C}">
-                          <a14:useLocalDpi xmlns:a14="http://schemas.microsoft.com/office/drawing/2010/main" val="0"/>
-                        </a:ext>
-                      </a:extLst>
-                    </a:blip>
-                    <a:srcRect/>
-                    <a:stretch>
-                      <a:fillRect/>
-                    </a:stretch>
-                  </pic:blipFill>
-                  <pic:spPr bwMode="auto">
-                    <a:xfrm>
-                      <a:off x="0" y="0"/>
-                      <a:ext cx="985487" cy="1303670"/>
-                    </a:xfrm>
-                    <a:prstGeom prst="rect">
-                      <a:avLst/>
-                    </a:prstGeom>
-                    <a:noFill/>
-                    <a:ln>
-                      <a:noFill/>
-                    </a:ln>
-                  </pic:spPr>
-                </pic:pic>
-              </a:graphicData>
-            </a:graphic>
-          </wp:inline>
-        </w:drawing>
-      </w:r>
-    </w:p>
-    <w:p/>
-    <w:p>
-      <w:pPr>
-        <w:pStyle w:val="BodyText"/>
-        <w:jc w:val="center"/>
-        <w:rPr>
-          <w:i/>
-          <w:iCs/>
-          <w:sz w:val="18"/>
-          <w:szCs w:val="18"/>
-          <w:lang w:val="en-GB"/>
-        </w:rPr>
-      </w:pPr>
-      <w:r>
-        <w:rPr>
-          <w:i/>
-          <w:iCs/>
-          <w:sz w:val="18"/>
-          <w:szCs w:val="18"/>
-          <w:lang w:val="en-GB"/>
-        </w:rPr>
-        <w:t xml:space="preserve">Figure </w:t>
-      </w:r>
-      <w:r>
-        <w:rPr>
-          <w:i/>
-          <w:iCs/>
-          <w:sz w:val="18"/>
-          <w:szCs w:val="18"/>
-          <w:lang w:val="en-GB"/>
-        </w:rPr>
-        <w:t>1.1.2</w:t>
-      </w:r>
-      <w:r>
-        <w:rPr>
-          <w:i/>
-          <w:iCs/>
-          <w:sz w:val="18"/>
-          <w:szCs w:val="18"/>
-          <w:lang w:val="en-GB"/>
-        </w:rPr>
-        <w:t xml:space="preserve">: Proximal Dendrite Representation [9] </w:t>
-      </w:r>
-    </w:p>
-    <w:p>
-      <w:pPr>
         <w:pStyle w:val="BodyText"/>
         <w:ind w:firstLine="0"/>
-        <w:rPr>
-          <w:i/>
-          <w:iCs/>
-          <w:highlight w:val="red"/>
-          <w:lang w:val="en-GB"/>
-        </w:rPr>
-      </w:pPr>
-    </w:p>
-    <w:p>
-      <w:pPr>
-        <w:pStyle w:val="BodyText"/>
-        <w:ind w:firstLine="0"/>
-        <w:rPr>
-          <w:rStyle w:val="Emphasis"/>
-          <w:b/>
-          <w:bCs/>
-          <w:lang w:val="en-GB"/>
-        </w:rPr>
-      </w:pPr>
-      <w:r>
-        <w:rPr>
-          <w:rStyle w:val="Emphasis"/>
-          <w:b/>
-          <w:bCs/>
-          <w:lang w:val="en-GB"/>
-        </w:rPr>
-        <w:t>1.</w:t>
-      </w:r>
-      <w:r>
-        <w:rPr>
-          <w:rStyle w:val="Emphasis"/>
-          <w:b/>
-          <w:bCs/>
-          <w:lang w:val="en-GB"/>
-        </w:rPr>
-        <w:t>1.3</w:t>
-      </w:r>
-      <w:r>
-        <w:rPr>
-          <w:rStyle w:val="Emphasis"/>
-          <w:b/>
-          <w:bCs/>
-          <w:lang w:val="en-GB"/>
-        </w:rPr>
-        <w:t>.   Distal Dendrite Segments</w:t>
-      </w:r>
-    </w:p>
-    <w:p>
-      <w:pPr>
-        <w:jc w:val="both"/>
-        <w:rPr>
-          <w:rFonts w:eastAsia="Times New Roman"/>
-        </w:rPr>
-      </w:pPr>
-      <w:r>
-        <w:rPr>
-          <w:rFonts w:eastAsia="Times New Roman"/>
-        </w:rPr>
-        <w:t>There are typically around 40 synapses in each of the 130 distal dendritic categories found in each brain cell. It has one proximal dendritic segment as well. A set of synapses can connect to a subset of other cells within a specific "learning radius," while nearby cells provide lateral input to the distal segments.</w:t>
-      </w:r>
-      <w:r>
-        <w:rPr>
-          <w:rFonts w:eastAsia="Times New Roman"/>
-          <w:sz w:val="24"/>
-          <w:szCs w:val="24"/>
-          <w:lang w:eastAsia="en-DE"/>
-        </w:rPr>
-        <w:t xml:space="preserve"> </w:t>
-      </w:r>
-      <w:r>
-        <w:rPr>
-          <w:rFonts w:eastAsia="Times New Roman"/>
-        </w:rPr>
-        <w:t xml:space="preserve">The dendritic segment remembers the activation status of the surrounding cells by connecting with previously activated cells. The cell enters an anticipatory state if a dendritic segment recognizes the same pattern of cellular activity, that is, if the number of activated synapses on any segment surpasses a certain threshold. Therefore, it is probable that column activation will arise from signalling that feedforward input. </w:t>
-      </w:r>
-      <w:r>
-        <w:rPr>
-          <w:rFonts w:eastAsia="Times New Roman"/>
-        </w:rPr>
-        <w:t>Fig</w:t>
-      </w:r>
-      <w:r>
-        <w:rPr>
-          <w:rFonts w:eastAsia="Times New Roman"/>
-        </w:rPr>
-        <w:t xml:space="preserve">. </w:t>
-      </w:r>
-      <w:r>
-        <w:rPr>
-          <w:rFonts w:eastAsia="Times New Roman"/>
-        </w:rPr>
-        <w:t>1.1.3</w:t>
-      </w:r>
-      <w:r>
-        <w:rPr>
-          <w:rFonts w:eastAsia="Times New Roman"/>
-        </w:rPr>
-        <w:t>[13]</w:t>
-      </w:r>
-      <w:r>
-        <w:rPr>
-          <w:rFonts w:eastAsia="Times New Roman"/>
-        </w:rPr>
-        <w:t>,</w:t>
-      </w:r>
-      <w:r>
-        <w:rPr>
-          <w:rFonts w:eastAsia="Times New Roman"/>
-        </w:rPr>
-        <w:t xml:space="preserve"> shows how an HTM cell enters a predictive or active state based on distal dendrite input and column activation, allowing temporal pattern recognition. </w:t>
-      </w:r>
-    </w:p>
-    <w:p>
-      <w:pPr>
-        <w:autoSpaceDE w:val="0"/>
-        <w:autoSpaceDN w:val="0"/>
-        <w:adjustRightInd w:val="0"/>
-        <w:ind w:firstLine="360"/>
-        <w:jc w:val="both"/>
-        <w:rPr>
-          <w:lang w:eastAsia="ja-JP"/>
-        </w:rPr>
-      </w:pPr>
-      <w:r>
-        <w:rPr>
-          <w:lang w:eastAsia="en-CA"/>
-        </w:rPr>
-        <w:drawing>
-          <wp:inline distT="0" distB="0" distL="0" distR="0" wp14:anchorId="41FA9DB5" wp14:editId="4681073D">
-            <wp:extent cx="2696021" cy="1541929"/>
-            <wp:effectExtent l="0" t="0" r="9525" b="1270"/>
-            <wp:docPr id="12" name="Picture 12" descr="A diagram of a cell"/>
-            <wp:cNvGraphicFramePr>
-              <a:graphicFrameLocks xmlns:a="http://schemas.openxmlformats.org/drawingml/2006/main" noChangeAspect="1"/>
-            </wp:cNvGraphicFramePr>
-            <a:graphic xmlns:a="http://schemas.openxmlformats.org/drawingml/2006/main">
-              <a:graphicData uri="http://schemas.openxmlformats.org/drawingml/2006/picture">
-                <pic:pic xmlns:pic="http://schemas.openxmlformats.org/drawingml/2006/picture">
-                  <pic:nvPicPr>
-                    <pic:cNvPr id="12" name="Picture 12" descr="A diagram of a cell"/>
-                    <pic:cNvPicPr/>
-                  </pic:nvPicPr>
-                  <pic:blipFill>
-                    <a:blip r:embed="rId15"/>
-                    <a:stretch>
-                      <a:fillRect/>
-                    </a:stretch>
-                  </pic:blipFill>
-                  <pic:spPr>
-                    <a:xfrm>
-                      <a:off x="0" y="0"/>
-                      <a:ext cx="2710115" cy="1549990"/>
-                    </a:xfrm>
-                    <a:prstGeom prst="rect">
-                      <a:avLst/>
-                    </a:prstGeom>
-                  </pic:spPr>
-                </pic:pic>
-              </a:graphicData>
-            </a:graphic>
-          </wp:inline>
-        </w:drawing>
-      </w:r>
-    </w:p>
-    <w:p>
-      <w:pPr>
-        <w:pStyle w:val="BodyText"/>
-        <w:jc w:val="center"/>
-        <w:rPr>
-          <w:i/>
-          <w:iCs/>
-          <w:sz w:val="18"/>
-          <w:szCs w:val="18"/>
-          <w:lang w:val="en-GB"/>
-        </w:rPr>
-      </w:pPr>
-      <w:r>
-        <w:rPr>
-          <w:i/>
-          <w:iCs/>
-          <w:sz w:val="18"/>
-          <w:szCs w:val="18"/>
-          <w:lang w:val="en-GB"/>
-        </w:rPr>
-        <w:t xml:space="preserve">Figure </w:t>
-      </w:r>
-      <w:r>
-        <w:rPr>
-          <w:i/>
-          <w:iCs/>
-          <w:sz w:val="18"/>
-          <w:szCs w:val="18"/>
-          <w:lang w:val="en-GB"/>
-        </w:rPr>
-        <w:t>1.1.3</w:t>
-      </w:r>
-      <w:r>
-        <w:rPr>
-          <w:i/>
-          <w:iCs/>
-          <w:sz w:val="18"/>
-          <w:szCs w:val="18"/>
-          <w:lang w:val="en-GB"/>
-        </w:rPr>
-        <w:t>: Distal Dendrite Segment at the Cellular Level [13]</w:t>
-      </w:r>
-    </w:p>
-    <w:p>
-      <w:pPr>
-        <w:pStyle w:val="BodyText"/>
-        <w:jc w:val="center"/>
         <w:rPr>
           <w:i/>
           <w:iCs/>
@@ -1818,7 +1412,7 @@
           <w:iCs/>
           <w:noProof w:val="0"/>
         </w:rPr>
-        <w:t>.4</w:t>
+        <w:t>.</w:t>
       </w:r>
       <w:r>
         <w:rPr>
@@ -1829,6 +1423,17 @@
           <w:iCs/>
           <w:noProof w:val="0"/>
         </w:rPr>
+        <w:t>2</w:t>
+      </w:r>
+      <w:r>
+        <w:rPr>
+          <w:rStyle w:val="Emphasis"/>
+          <w:b/>
+          <w:bCs/>
+          <w:i/>
+          <w:iCs/>
+          <w:noProof w:val="0"/>
+        </w:rPr>
         <w:t>.  Prediction</w:t>
       </w:r>
     </w:p>
@@ -1843,24 +1448,34 @@
         <w:rPr>
           <w:rFonts w:eastAsia="Times New Roman"/>
         </w:rPr>
-        <w:t>Its primary function is estimate, which is the basis of intelligence. It makes predictions about the real world using both new incoming data and static representations [15].</w:t>
-      </w:r>
+        <w:t>Its primary function is estimate, which is the basis of intelligence. It makes predictions about the real world using both new incoming data and static representations [1</w:t>
+      </w:r>
+      <w:r>
+        <w:rPr>
+          <w:rFonts w:eastAsia="Times New Roman"/>
+        </w:rPr>
+        <w:t>1</w:t>
+      </w:r>
+      <w:r>
+        <w:rPr>
+          <w:rFonts w:eastAsia="Times New Roman"/>
+        </w:rPr>
+        <w:t>].</w:t>
+      </w:r>
+    </w:p>
+    <w:p>
+      <w:pPr>
+        <w:jc w:val="both"/>
+        <w:rPr>
+          <w:rFonts w:eastAsia="Times New Roman"/>
+        </w:rPr>
+      </w:pPr>
     </w:p>
     <w:p>
       <w:pPr>
         <w:pStyle w:val="BodyText"/>
         <w:ind w:firstLine="0"/>
         <w:rPr>
-          <w:highlight w:val="red"/>
-          <w:lang w:val="en-GB" w:eastAsia="ja-JP"/>
-        </w:rPr>
-      </w:pPr>
-    </w:p>
-    <w:p>
-      <w:pPr>
-        <w:pStyle w:val="BodyText"/>
-        <w:ind w:firstLine="0"/>
-        <w:rPr>
           <w:rStyle w:val="Emphasis"/>
           <w:b/>
           <w:bCs/>
@@ -1883,7 +1498,16 @@
           <w:bCs/>
           <w:lang w:val="en-GB"/>
         </w:rPr>
-        <w:t>1.5</w:t>
+        <w:t>1.</w:t>
+      </w:r>
+      <w:r>
+        <w:rPr>
+          <w:rStyle w:val="Emphasis"/>
+          <w:b/>
+          <w:bCs/>
+          <w:lang w:val="en-GB"/>
+        </w:rPr>
+        <w:t>3</w:t>
       </w:r>
       <w:r>
         <w:rPr>
@@ -1952,7 +1576,15 @@
           <w:bCs/>
           <w:noProof w:val="0"/>
         </w:rPr>
-        <w:t>1.6</w:t>
+        <w:t>1.</w:t>
+      </w:r>
+      <w:r>
+        <w:rPr>
+          <w:b/>
+          <w:bCs/>
+          <w:noProof w:val="0"/>
+        </w:rPr>
+        <w:t>4</w:t>
       </w:r>
       <w:r>
         <w:rPr>
@@ -1980,13 +1612,37 @@
         <w:rPr>
           <w:rFonts w:eastAsia="Times New Roman"/>
         </w:rPr>
-        <w:t>1.1.6</w:t>
+        <w:t>1.1.</w:t>
       </w:r>
       <w:r>
         <w:rPr>
           <w:rFonts w:eastAsia="Times New Roman"/>
         </w:rPr>
-        <w:t>[16], which necessitates a weighted average of inputs followed by a non-linear operation on the total, the HTM neuron model is modelled after cortical neurons. The basis for memory and recall in the brain is provided by biological neurons, which carry out increasingly complex functions and interact through both chemical and electrical impulses, according to recent neuroscience studies.</w:t>
+        <w:t>4</w:t>
+      </w:r>
+      <w:r>
+        <w:rPr>
+          <w:rFonts w:eastAsia="Times New Roman"/>
+        </w:rPr>
+        <w:t>[1</w:t>
+      </w:r>
+      <w:r>
+        <w:rPr>
+          <w:rFonts w:eastAsia="Times New Roman"/>
+        </w:rPr>
+        <w:t>2</w:t>
+      </w:r>
+      <w:r>
+        <w:rPr>
+          <w:rFonts w:eastAsia="Times New Roman"/>
+        </w:rPr>
+        <w:t xml:space="preserve">], which necessitates a weighted average of inputs followed by a non-linear operation on the total, the HTM neuron model is modelled after cortical neurons. The </w:t>
+      </w:r>
+      <w:r>
+        <w:rPr>
+          <w:rFonts w:eastAsia="Times New Roman"/>
+        </w:rPr>
+        <w:t>basis for memory and recall in the brain is provided by biological neurons, which carry out increasingly complex functions and interact through both chemical and electrical impulses, according to recent neuroscience studies.</w:t>
       </w:r>
     </w:p>
     <w:p>
@@ -2001,7 +1657,6 @@
         <w:rPr>
           <w:lang w:val="en-GB"/>
         </w:rPr>
-        <w:lastRenderedPageBreak/>
         <w:fldChar w:fldCharType="begin"/>
       </w:r>
       <w:r>
@@ -2018,6 +1673,7 @@
       </w:r>
       <w:r>
         <w:rPr>
+          <w:noProof/>
           <w:lang w:val="en-GB" w:eastAsia="en-CA"/>
         </w:rPr>
         <w:drawing>
@@ -2036,7 +1692,7 @@
                     <pic:cNvPicPr/>
                   </pic:nvPicPr>
                   <pic:blipFill rotWithShape="1">
-                    <a:blip r:embed="rId16">
+                    <a:blip r:embed="rId14">
                       <a:extLst>
                         <a:ext uri="{28A0092B-C50C-407E-A947-70E740481C1C}">
                           <a14:useLocalDpi xmlns:a14="http://schemas.microsoft.com/office/drawing/2010/main" val="0"/>
@@ -2106,7 +1762,7 @@
           <w:szCs w:val="18"/>
           <w:lang w:val="en-GB"/>
         </w:rPr>
-        <w:t>1.1.6</w:t>
+        <w:t>1.1.</w:t>
       </w:r>
       <w:r>
         <w:rPr>
@@ -2116,7 +1772,37 @@
           <w:szCs w:val="18"/>
           <w:lang w:val="en-GB"/>
         </w:rPr>
-        <w:t>: Neuron Structure [11]</w:t>
+        <w:t>4</w:t>
+      </w:r>
+      <w:r>
+        <w:rPr>
+          <w:i/>
+          <w:iCs/>
+          <w:sz w:val="18"/>
+          <w:szCs w:val="18"/>
+          <w:lang w:val="en-GB"/>
+        </w:rPr>
+        <w:t>: Neuron Structure [</w:t>
+      </w:r>
+      <w:r>
+        <w:rPr>
+          <w:i/>
+          <w:iCs/>
+          <w:sz w:val="18"/>
+          <w:szCs w:val="18"/>
+          <w:lang w:val="en-GB"/>
+        </w:rPr>
+        <w:t>9</w:t>
+      </w:r>
+      <w:r>
+        <w:rPr>
+          <w:i/>
+          <w:iCs/>
+          <w:sz w:val="18"/>
+          <w:szCs w:val="18"/>
+          <w:lang w:val="en-GB"/>
+        </w:rPr>
+        <w:t>]</w:t>
       </w:r>
     </w:p>
     <w:p>
@@ -2176,7 +1862,15 @@
           <w:bCs/>
           <w:noProof w:val="0"/>
         </w:rPr>
-        <w:t>7.</w:t>
+        <w:t>5</w:t>
+      </w:r>
+      <w:r>
+        <w:rPr>
+          <w:b/>
+          <w:bCs/>
+          <w:noProof w:val="0"/>
+        </w:rPr>
+        <w:t>.</w:t>
       </w:r>
       <w:r>
         <w:rPr>
@@ -2200,7 +1894,7 @@
         <w:pStyle w:val="Heading2"/>
         <w:numPr>
           <w:ilvl w:val="2"/>
-          <w:numId w:val="19"/>
+          <w:numId w:val="22"/>
         </w:numPr>
         <w:rPr>
           <w:b/>
@@ -2235,6 +1929,14 @@
       <w:r>
         <w:t>In order to identify temporal patterns in the input data, the SP encoder uses a sliding window technique and is designed to handle temporal data. The incoming data is first converted into a continuous stream of binary values, which are subsequently fed into the HTM network as a sequence of SDRs [5].</w:t>
       </w:r>
+    </w:p>
+    <w:p>
+      <w:pPr>
+        <w:jc w:val="both"/>
+        <w:rPr>
+          <w:highlight w:val="red"/>
+        </w:rPr>
+      </w:pPr>
     </w:p>
     <w:p>
       <w:pPr>
@@ -2270,6 +1972,7 @@
           <w:i/>
           <w:iCs/>
         </w:rPr>
+        <w:lastRenderedPageBreak/>
         <w:t>1</w:t>
       </w:r>
       <w:r>
@@ -2288,7 +1991,25 @@
           <w:i/>
           <w:iCs/>
         </w:rPr>
-        <w:t>.9.</w:t>
+        <w:t>.</w:t>
+      </w:r>
+      <w:r>
+        <w:rPr>
+          <w:b/>
+          <w:bCs/>
+          <w:i/>
+          <w:iCs/>
+        </w:rPr>
+        <w:t>7</w:t>
+      </w:r>
+      <w:r>
+        <w:rPr>
+          <w:b/>
+          <w:bCs/>
+          <w:i/>
+          <w:iCs/>
+        </w:rPr>
+        <w:t>.</w:t>
       </w:r>
       <w:r>
         <w:rPr>
@@ -2306,10 +2027,7 @@
         <w:jc w:val="left"/>
       </w:pPr>
       <w:r>
-        <w:t xml:space="preserve">An unsupervised learning technique called the Spatial Pooler transforms high-dimensional input data into a lower-dimensional SDR that captures the key characteristics of the input data. To do this, it first gives </w:t>
-      </w:r>
-      <w:r>
-        <w:t xml:space="preserve">each input characteristic an arbitrary number of weights, after which it determines how much the input and the weights overlap. After that, the traits that overlap the most are selected and included to the </w:t>
+        <w:t xml:space="preserve">An unsupervised learning technique called the Spatial Pooler transforms high-dimensional input data into a lower-dimensional SDR that captures the key characteristics of the input data. To do this, it first gives each input characteristic an arbitrary number of weights, after which it determines how much the input and the weights overlap. After that, the traits that overlap the most are selected and included to the </w:t>
       </w:r>
       <w:r>
         <w:t>SDR [</w:t>
@@ -2324,10 +2042,19 @@
         <w:t>Fig .</w:t>
       </w:r>
       <w:r>
-        <w:t>1.1.9</w:t>
-      </w:r>
-      <w:r>
-        <w:t>[12]</w:t>
+        <w:t>1.1.</w:t>
+      </w:r>
+      <w:r>
+        <w:t>7</w:t>
+      </w:r>
+      <w:r>
+        <w:t>[1</w:t>
+      </w:r>
+      <w:r>
+        <w:t>0</w:t>
+      </w:r>
+      <w:r>
+        <w:t>]</w:t>
       </w:r>
       <w:r>
         <w:t xml:space="preserve"> illustrated the way spatial polling in HTM detects active mini-columns based on input patterns, which forms sparse distributed representations using probable synaptic connections.  </w:t>
@@ -2340,6 +2067,9 @@
         </w:rPr>
       </w:pPr>
       <w:r>
+        <w:rPr>
+          <w:noProof/>
+        </w:rPr>
         <w:drawing>
           <wp:inline distT="0" distB="0" distL="0" distR="0" wp14:anchorId="78AB5049" wp14:editId="6A2EDDD1">
             <wp:extent cx="2682472" cy="1386960"/>
@@ -2356,7 +2086,7 @@
                     <pic:cNvPicPr/>
                   </pic:nvPicPr>
                   <pic:blipFill>
-                    <a:blip r:embed="rId17"/>
+                    <a:blip r:embed="rId15"/>
                     <a:stretch>
                       <a:fillRect/>
                     </a:stretch>
@@ -2418,7 +2148,7 @@
           <w:szCs w:val="18"/>
           <w:lang w:val="en-GB"/>
         </w:rPr>
-        <w:t>1.1.9</w:t>
+        <w:t>1.1.</w:t>
       </w:r>
       <w:r>
         <w:rPr>
@@ -2428,6 +2158,16 @@
           <w:szCs w:val="18"/>
           <w:lang w:val="en-GB"/>
         </w:rPr>
+        <w:t>7</w:t>
+      </w:r>
+      <w:r>
+        <w:rPr>
+          <w:i/>
+          <w:iCs/>
+          <w:sz w:val="18"/>
+          <w:szCs w:val="18"/>
+          <w:lang w:val="en-GB"/>
+        </w:rPr>
         <w:t xml:space="preserve">: Representation of spatial </w:t>
       </w:r>
       <w:r>
@@ -2448,7 +2188,27 @@
           <w:szCs w:val="18"/>
           <w:lang w:val="en-GB"/>
         </w:rPr>
-        <w:t>12]</w:t>
+        <w:t>1</w:t>
+      </w:r>
+      <w:r>
+        <w:rPr>
+          <w:i/>
+          <w:iCs/>
+          <w:sz w:val="18"/>
+          <w:szCs w:val="18"/>
+          <w:lang w:val="en-GB"/>
+        </w:rPr>
+        <w:t>0</w:t>
+      </w:r>
+      <w:r>
+        <w:rPr>
+          <w:i/>
+          <w:iCs/>
+          <w:sz w:val="18"/>
+          <w:szCs w:val="18"/>
+          <w:lang w:val="en-GB"/>
+        </w:rPr>
+        <w:t>]</w:t>
       </w:r>
     </w:p>
     <w:p>
@@ -2479,7 +2239,23 @@
           <w:bCs/>
           <w:noProof w:val="0"/>
         </w:rPr>
-        <w:t>1.10.  Sparse Distributed Representation</w:t>
+        <w:t>1.</w:t>
+      </w:r>
+      <w:r>
+        <w:rPr>
+          <w:b/>
+          <w:bCs/>
+          <w:noProof w:val="0"/>
+        </w:rPr>
+        <w:t>8</w:t>
+      </w:r>
+      <w:r>
+        <w:rPr>
+          <w:b/>
+          <w:bCs/>
+          <w:noProof w:val="0"/>
+        </w:rPr>
+        <w:t>.  Sparse Distributed Representation</w:t>
       </w:r>
     </w:p>
     <w:p>
@@ -2525,7 +2301,23 @@
           <w:bCs/>
           <w:noProof w:val="0"/>
         </w:rPr>
-        <w:t>1.11.  Multisequence Learning</w:t>
+        <w:t>1.</w:t>
+      </w:r>
+      <w:r>
+        <w:rPr>
+          <w:b/>
+          <w:bCs/>
+          <w:noProof w:val="0"/>
+        </w:rPr>
+        <w:t>9</w:t>
+      </w:r>
+      <w:r>
+        <w:rPr>
+          <w:b/>
+          <w:bCs/>
+          <w:noProof w:val="0"/>
+        </w:rPr>
+        <w:t>.  Multisequence Learning</w:t>
       </w:r>
     </w:p>
     <w:p>
@@ -2650,23 +2442,22 @@
         <w:t xml:space="preserve">, </w:t>
       </w:r>
       <w:r>
-        <w:t xml:space="preserve">Implemented in Program.cs, command line arguments are being parses with this component such as --sequence-folder, --out, --experiment, </w:t>
-      </w:r>
-      <w:r>
-        <w:lastRenderedPageBreak/>
-        <w:t xml:space="preserve">--cores, --affinity. Experiment gets dynamically configured at runtime with this component. </w:t>
-      </w:r>
-    </w:p>
-    <w:p>
-      <w:pPr>
-        <w:jc w:val="both"/>
-      </w:pPr>
-    </w:p>
-    <w:p>
-      <w:pPr>
-        <w:jc w:val="both"/>
-      </w:pPr>
-      <w:r>
+        <w:t xml:space="preserve">Implemented in Program.cs, command line arguments are being parses with this component such as --sequence-folder, --out, --experiment, --cores, --affinity. Experiment gets dynamically configured at runtime with this component. </w:t>
+      </w:r>
+    </w:p>
+    <w:p>
+      <w:pPr>
+        <w:jc w:val="both"/>
+      </w:pPr>
+    </w:p>
+    <w:p>
+      <w:pPr>
+        <w:jc w:val="both"/>
+      </w:pPr>
+      <w:r>
+        <w:rPr>
+          <w:noProof/>
+        </w:rPr>
         <w:drawing>
           <wp:inline distT="0" distB="0" distL="0" distR="0" wp14:anchorId="6A31C7A2" wp14:editId="0DDBE79A">
             <wp:extent cx="2984500" cy="286385"/>
@@ -2683,7 +2474,7 @@
                     <pic:cNvPicPr/>
                   </pic:nvPicPr>
                   <pic:blipFill>
-                    <a:blip r:embed="rId18"/>
+                    <a:blip r:embed="rId16"/>
                     <a:stretch>
                       <a:fillRect/>
                     </a:stretch>
@@ -2819,6 +2610,7 @@
       </w:pPr>
       <w:r>
         <w:rPr>
+          <w:noProof/>
           <w:lang w:eastAsia="en-CA"/>
         </w:rPr>
         <mc:AlternateContent>
@@ -2983,6 +2775,7 @@
     <w:p>
       <w:r>
         <w:rPr>
+          <w:noProof/>
           <w:lang w:eastAsia="en-CA"/>
         </w:rPr>
         <mc:AlternateContent>
@@ -3250,6 +3043,9 @@
         <w:jc w:val="both"/>
       </w:pPr>
       <w:r>
+        <w:rPr>
+          <w:noProof/>
+        </w:rPr>
         <w:drawing>
           <wp:inline distT="0" distB="0" distL="0" distR="0" wp14:anchorId="275E3370" wp14:editId="7475B10B">
             <wp:extent cx="2982632" cy="626806"/>
@@ -3266,7 +3062,7 @@
                     <pic:cNvPicPr/>
                   </pic:nvPicPr>
                   <pic:blipFill>
-                    <a:blip r:embed="rId19"/>
+                    <a:blip r:embed="rId17"/>
                     <a:stretch>
                       <a:fillRect/>
                     </a:stretch>
@@ -3381,19 +3177,26 @@
         <w:t>.</w:t>
       </w:r>
       <w:r>
-        <w:t xml:space="preserve"> 2.1.4 shows the method which is the core training entry point for MultiSequenceLearning experiment that initializes the HTM configuration and encoder settings, then runs the experiment using the given input sequences.</w:t>
-      </w:r>
-    </w:p>
-    <w:p>
-      <w:pPr>
-        <w:jc w:val="both"/>
-      </w:pPr>
-    </w:p>
-    <w:p>
-      <w:pPr>
-        <w:jc w:val="both"/>
-      </w:pPr>
-      <w:r>
+        <w:t xml:space="preserve"> 2.1.4 shows the method which is the core training entry point for MultiSequenceLearning experiment that initializes the </w:t>
+      </w:r>
+      <w:r>
+        <w:lastRenderedPageBreak/>
+        <w:t>HTM configuration and encoder settings, then runs the experiment using the given input sequences.</w:t>
+      </w:r>
+    </w:p>
+    <w:p>
+      <w:pPr>
+        <w:jc w:val="both"/>
+      </w:pPr>
+    </w:p>
+    <w:p>
+      <w:pPr>
+        <w:jc w:val="both"/>
+      </w:pPr>
+      <w:r>
+        <w:rPr>
+          <w:noProof/>
+        </w:rPr>
         <w:drawing>
           <wp:inline distT="0" distB="0" distL="0" distR="0" wp14:anchorId="21F1F28E" wp14:editId="0F180D6D">
             <wp:extent cx="2984500" cy="973455"/>
@@ -3410,7 +3213,7 @@
                     <pic:cNvPicPr/>
                   </pic:nvPicPr>
                   <pic:blipFill>
-                    <a:blip r:embed="rId20"/>
+                    <a:blip r:embed="rId18"/>
                     <a:stretch>
                       <a:fillRect/>
                     </a:stretch>
@@ -4292,7 +4095,10 @@
         <w:t>generate_charts.py</w:t>
       </w:r>
       <w:r>
-        <w:t>, this python script was used to generate performance charts based on the logged CSV data. The pandas library was used for data processing, and for visualization matplotlib and seaborn was used. Learning time, CPU core usage, .NET version and CPU speed were visualized to explore the correlations.</w:t>
+        <w:t xml:space="preserve">, this python script was used to generate performance charts based on the logged CSV data. The pandas library was used for data processing, and for visualization matplotlib and seaborn was used. Learning </w:t>
+      </w:r>
+      <w:r>
+        <w:t>time, CPU core usage, .NET version and CPU speed were visualized to explore the correlations.</w:t>
       </w:r>
     </w:p>
     <w:p>
@@ -4310,7 +4116,6 @@
         <w:rPr>
           <w:noProof w:val="0"/>
         </w:rPr>
-        <w:lastRenderedPageBreak/>
         <w:t>3.     IMPLEMENTATION</w:t>
       </w:r>
     </w:p>
@@ -4782,6 +4587,9 @@
         </w:rPr>
       </w:pPr>
       <w:r>
+        <w:rPr>
+          <w:noProof/>
+        </w:rPr>
         <w:drawing>
           <wp:inline distT="0" distB="0" distL="0" distR="0" wp14:anchorId="37A5D3FD" wp14:editId="15EE2A4D">
             <wp:extent cx="2984500" cy="286385"/>
@@ -4798,7 +4606,7 @@
                     <pic:cNvPicPr/>
                   </pic:nvPicPr>
                   <pic:blipFill>
-                    <a:blip r:embed="rId18"/>
+                    <a:blip r:embed="rId16"/>
                     <a:stretch>
                       <a:fillRect/>
                     </a:stretch>
@@ -4971,6 +4779,9 @@
         <w:br/>
       </w:r>
       <w:r>
+        <w:rPr>
+          <w:noProof/>
+        </w:rPr>
         <w:drawing>
           <wp:inline distT="0" distB="0" distL="0" distR="0" wp14:anchorId="7A65AE4D" wp14:editId="7118F4DA">
             <wp:extent cx="2979284" cy="176980"/>
@@ -4987,7 +4798,7 @@
                     <pic:cNvPicPr/>
                   </pic:nvPicPr>
                   <pic:blipFill>
-                    <a:blip r:embed="rId21"/>
+                    <a:blip r:embed="rId19"/>
                     <a:stretch>
                       <a:fillRect/>
                     </a:stretch>
@@ -5144,6 +4955,9 @@
         <w:jc w:val="both"/>
       </w:pPr>
       <w:r>
+        <w:rPr>
+          <w:noProof/>
+        </w:rPr>
         <w:drawing>
           <wp:inline distT="0" distB="0" distL="0" distR="0" wp14:anchorId="6AFEAE0D" wp14:editId="014A7931">
             <wp:extent cx="2984500" cy="188186"/>
@@ -5160,7 +4974,7 @@
                     <pic:cNvPicPr/>
                   </pic:nvPicPr>
                   <pic:blipFill>
-                    <a:blip r:embed="rId22"/>
+                    <a:blip r:embed="rId20"/>
                     <a:stretch>
                       <a:fillRect/>
                     </a:stretch>
@@ -5264,6 +5078,9 @@
         <w:jc w:val="both"/>
       </w:pPr>
       <w:r>
+        <w:rPr>
+          <w:noProof/>
+        </w:rPr>
         <w:drawing>
           <wp:inline distT="0" distB="0" distL="0" distR="0" wp14:anchorId="47CBAEE1" wp14:editId="40FD8950">
             <wp:extent cx="2981190" cy="516193"/>
@@ -5280,7 +5097,7 @@
                     <pic:cNvPicPr/>
                   </pic:nvPicPr>
                   <pic:blipFill>
-                    <a:blip r:embed="rId23"/>
+                    <a:blip r:embed="rId21"/>
                     <a:stretch>
                       <a:fillRect/>
                     </a:stretch>
@@ -5444,6 +5261,9 @@
         </w:rPr>
       </w:pPr>
       <w:r>
+        <w:rPr>
+          <w:noProof/>
+        </w:rPr>
         <w:drawing>
           <wp:inline distT="0" distB="0" distL="0" distR="0" wp14:anchorId="3EE47E16" wp14:editId="75EBE956">
             <wp:extent cx="2974606" cy="345624"/>
@@ -5460,7 +5280,7 @@
                     <pic:cNvPicPr/>
                   </pic:nvPicPr>
                   <pic:blipFill>
-                    <a:blip r:embed="rId24"/>
+                    <a:blip r:embed="rId22"/>
                     <a:stretch>
                       <a:fillRect/>
                     </a:stretch>
@@ -5570,6 +5390,9 @@
         <w:br/>
       </w:r>
       <w:r>
+        <w:rPr>
+          <w:noProof/>
+        </w:rPr>
         <w:drawing>
           <wp:inline distT="0" distB="0" distL="0" distR="0" wp14:anchorId="3BCD6AF1" wp14:editId="68B8E920">
             <wp:extent cx="2984500" cy="184355"/>
@@ -5586,7 +5409,7 @@
                     <pic:cNvPicPr/>
                   </pic:nvPicPr>
                   <pic:blipFill>
-                    <a:blip r:embed="rId25"/>
+                    <a:blip r:embed="rId23"/>
                     <a:stretch>
                       <a:fillRect/>
                     </a:stretch>
@@ -5714,6 +5537,9 @@
         <w:br/>
       </w:r>
       <w:r>
+        <w:rPr>
+          <w:noProof/>
+        </w:rPr>
         <w:drawing>
           <wp:inline distT="0" distB="0" distL="0" distR="0" wp14:anchorId="1BCC6C36" wp14:editId="3D3A2BC4">
             <wp:extent cx="2984500" cy="776441"/>
@@ -5730,7 +5556,7 @@
                     <pic:cNvPicPr/>
                   </pic:nvPicPr>
                   <pic:blipFill>
-                    <a:blip r:embed="rId26"/>
+                    <a:blip r:embed="rId24"/>
                     <a:stretch>
                       <a:fillRect/>
                     </a:stretch>
@@ -6033,11 +5859,7 @@
         <w:t>were</w:t>
       </w:r>
       <w:r>
-        <w:t xml:space="preserve"> gathered from 48 runs of the experiment, 24 time for each .NET 8.014 and </w:t>
-      </w:r>
-      <w:r>
-        <w:lastRenderedPageBreak/>
-        <w:t>.NET 9.0.3. For each runtime, the application was executed with 8 configurations, each using 1 to 8 CPU cores. Every configuration was repeated 3 times to make sure the statistical reliability. The following diagrams are for visual trend analysis</w:t>
+        <w:t xml:space="preserve"> gathered from 48 runs of the experiment, 24 time for each .NET 8.014 and .NET 9.0.3. For each runtime, the application was executed with 8 configurations, each using 1 to 8 CPU cores. Every configuration was repeated 3 times to make sure the statistical reliability. The following diagrams are for visual trend analysis</w:t>
       </w:r>
       <w:r>
         <w:t xml:space="preserve"> from the output metrics that has been logged in output csv (Result.csv)</w:t>
@@ -6087,39 +5909,75 @@
     <w:p>
       <w:pPr>
         <w:jc w:val="both"/>
-      </w:pPr>
-      <w:r>
-        <w:t>The average learning time with respect to the number of CPU cores used is shown in the bar plot</w:t>
-      </w:r>
-      <w:r>
-        <w:t xml:space="preserve"> in Fig</w:t>
-      </w:r>
-      <w:r>
-        <w:t>.</w:t>
-      </w:r>
-      <w:r>
-        <w:t xml:space="preserve"> 4.1</w:t>
-      </w:r>
-      <w:r>
-        <w:t xml:space="preserve">.  From the bar plot, a downward trend is displayed as the core count increases from 1 to 8, which indicates that the model training benefits from parallel computation. However, at 6 cores, an anomaly was observed where the learning time increased abnormally. This sudden spike could be due to </w:t>
-      </w:r>
-      <w:r>
-        <w:t>temporary</w:t>
-      </w:r>
-      <w:r>
-        <w:t xml:space="preserve"> </w:t>
-      </w:r>
-      <w:r>
-        <w:t xml:space="preserve">system </w:t>
-      </w:r>
-      <w:r>
-        <w:t xml:space="preserve">resource contention, garbage collection or other background processes which may affect the performance </w:t>
-      </w:r>
-      <w:r>
-        <w:t>at</w:t>
-      </w:r>
-      <w:r>
-        <w:t xml:space="preserve"> the time of that set of trials.</w:t>
+        <w:rPr>
+          <w:lang w:val="en-DE"/>
+        </w:rPr>
+      </w:pPr>
+      <w:r>
+        <w:rPr>
+          <w:lang w:val="en-DE"/>
+        </w:rPr>
+        <w:t xml:space="preserve">The </w:t>
+      </w:r>
+      <w:r>
+        <w:rPr>
+          <w:lang w:val="en-DE"/>
+        </w:rPr>
+        <w:t>Fig. 4.1</w:t>
+      </w:r>
+      <w:r>
+        <w:rPr>
+          <w:lang w:val="en-DE"/>
+        </w:rPr>
+        <w:t xml:space="preserve"> illustrates a broad pattern of learning time reducing as CPU core count rises. The median learning time </w:t>
+      </w:r>
+      <w:r>
+        <w:rPr>
+          <w:lang w:val="en-DE"/>
+        </w:rPr>
+        <w:t>consistently</w:t>
+      </w:r>
+      <w:r>
+        <w:rPr>
+          <w:lang w:val="en-DE"/>
+        </w:rPr>
+        <w:t xml:space="preserve"> decreased as the number of cores rose from </w:t>
+      </w:r>
+      <w:r>
+        <w:rPr>
+          <w:lang w:val="en-DE"/>
+        </w:rPr>
+        <w:t>1</w:t>
+      </w:r>
+      <w:r>
+        <w:rPr>
+          <w:lang w:val="en-DE"/>
+        </w:rPr>
+        <w:t xml:space="preserve"> to </w:t>
+      </w:r>
+      <w:r>
+        <w:rPr>
+          <w:lang w:val="en-DE"/>
+        </w:rPr>
+        <w:t>8</w:t>
+      </w:r>
+      <w:r>
+        <w:rPr>
+          <w:lang w:val="en-DE"/>
+        </w:rPr>
+        <w:t xml:space="preserve">. The box plot for </w:t>
+      </w:r>
+      <w:r>
+        <w:rPr>
+          <w:lang w:val="en-DE"/>
+        </w:rPr>
+        <w:t>6</w:t>
+      </w:r>
+      <w:r>
+        <w:rPr>
+          <w:lang w:val="en-DE"/>
+        </w:rPr>
+        <w:t xml:space="preserve"> cores, however, shows a noticeably greater data spread, suggesting erratic performance that may be brought on by outside variables like background processes or uneven memory utilization. Although ideal gains are not always linear and may vary on system conditions, the overall result confirms that adding CPU cores increases training efficiency.</w:t>
       </w:r>
     </w:p>
     <w:p>
@@ -6130,11 +5988,14 @@
         </w:rPr>
       </w:pPr>
       <w:r>
+        <w:rPr>
+          <w:noProof/>
+        </w:rPr>
         <w:drawing>
-          <wp:inline distT="0" distB="0" distL="0" distR="0" wp14:anchorId="7B9D02F9" wp14:editId="7B3CBDE9">
+          <wp:inline distT="0" distB="0" distL="0" distR="0" wp14:anchorId="33F60583" wp14:editId="3ACE5FF2">
             <wp:extent cx="2984500" cy="1865630"/>
             <wp:effectExtent l="0" t="0" r="6350" b="1270"/>
-            <wp:docPr id="106209959" name="Picture 3" descr="A graph of a graph&#10;&#10;AI-generated content may be incorrect."/>
+            <wp:docPr id="2007816502" name="Picture 3" descr="A graph of a graph showing a number of different sizes and colors&#10;&#10;AI-generated content may be incorrect."/>
             <wp:cNvGraphicFramePr>
               <a:graphicFrameLocks xmlns:a="http://schemas.openxmlformats.org/drawingml/2006/main" noChangeAspect="1"/>
             </wp:cNvGraphicFramePr>
@@ -6142,7 +6003,405 @@
               <a:graphicData uri="http://schemas.openxmlformats.org/drawingml/2006/picture">
                 <pic:pic xmlns:pic="http://schemas.openxmlformats.org/drawingml/2006/picture">
                   <pic:nvPicPr>
-                    <pic:cNvPr id="106209959" name="Picture 3" descr="A graph of a graph&#10;&#10;AI-generated content may be incorrect."/>
+                    <pic:cNvPr id="2007816502" name="Picture 3" descr="A graph of a graph showing a number of different sizes and colors&#10;&#10;AI-generated content may be incorrect."/>
+                    <pic:cNvPicPr>
+                      <a:picLocks noChangeAspect="1" noChangeArrowheads="1"/>
+                    </pic:cNvPicPr>
+                  </pic:nvPicPr>
+                  <pic:blipFill>
+                    <a:blip r:embed="rId25" cstate="print">
+                      <a:extLst>
+                        <a:ext uri="{28A0092B-C50C-407E-A947-70E740481C1C}">
+                          <a14:useLocalDpi xmlns:a14="http://schemas.microsoft.com/office/drawing/2010/main" val="0"/>
+                        </a:ext>
+                      </a:extLst>
+                    </a:blip>
+                    <a:srcRect/>
+                    <a:stretch>
+                      <a:fillRect/>
+                    </a:stretch>
+                  </pic:blipFill>
+                  <pic:spPr bwMode="auto">
+                    <a:xfrm>
+                      <a:off x="0" y="0"/>
+                      <a:ext cx="2984500" cy="1865630"/>
+                    </a:xfrm>
+                    <a:prstGeom prst="rect">
+                      <a:avLst/>
+                    </a:prstGeom>
+                    <a:noFill/>
+                    <a:ln>
+                      <a:noFill/>
+                    </a:ln>
+                  </pic:spPr>
+                </pic:pic>
+              </a:graphicData>
+            </a:graphic>
+          </wp:inline>
+        </w:drawing>
+      </w:r>
+    </w:p>
+    <w:p>
+      <w:r>
+        <w:rPr>
+          <w:i/>
+          <w:iCs/>
+          <w:sz w:val="18"/>
+          <w:szCs w:val="18"/>
+        </w:rPr>
+        <w:t>Figure</w:t>
+      </w:r>
+      <w:r>
+        <w:rPr>
+          <w:i/>
+          <w:iCs/>
+          <w:sz w:val="18"/>
+          <w:szCs w:val="18"/>
+        </w:rPr>
+        <w:t xml:space="preserve"> 4.1</w:t>
+      </w:r>
+      <w:r>
+        <w:rPr>
+          <w:i/>
+          <w:iCs/>
+          <w:sz w:val="18"/>
+          <w:szCs w:val="18"/>
+        </w:rPr>
+        <w:t>.: Learning time vs CPU Cores</w:t>
+      </w:r>
+    </w:p>
+    <w:p>
+      <w:pPr>
+        <w:jc w:val="both"/>
+        <w:rPr>
+          <w:highlight w:val="red"/>
+        </w:rPr>
+      </w:pPr>
+    </w:p>
+    <w:p>
+      <w:pPr>
+        <w:pStyle w:val="Heading2"/>
+        <w:numPr>
+          <w:ilvl w:val="0"/>
+          <w:numId w:val="0"/>
+        </w:numPr>
+        <w:rPr>
+          <w:b/>
+          <w:bCs/>
+          <w:noProof w:val="0"/>
+        </w:rPr>
+      </w:pPr>
+      <w:bookmarkStart w:id="2" w:name="_Hlk193912395"/>
+      <w:r>
+        <w:rPr>
+          <w:b/>
+          <w:bCs/>
+          <w:noProof w:val="0"/>
+        </w:rPr>
+        <w:t>4.2.  Learning Time vs CPU Speed</w:t>
+      </w:r>
+      <w:bookmarkEnd w:id="2"/>
+      <w:r>
+        <w:rPr>
+          <w:b/>
+          <w:bCs/>
+          <w:noProof w:val="0"/>
+        </w:rPr>
+        <w:t xml:space="preserve">  </w:t>
+      </w:r>
+    </w:p>
+    <w:p>
+      <w:pPr>
+        <w:jc w:val="both"/>
+        <w:rPr>
+          <w:lang w:val="en-DE"/>
+        </w:rPr>
+      </w:pPr>
+      <w:r>
+        <w:t>Fig</w:t>
+      </w:r>
+      <w:r>
+        <w:t>.</w:t>
+      </w:r>
+      <w:r>
+        <w:t xml:space="preserve"> 4.2 </w:t>
+      </w:r>
+      <w:r>
+        <w:t>shows</w:t>
+      </w:r>
+      <w:r>
+        <w:t xml:space="preserve"> the</w:t>
+      </w:r>
+      <w:r>
+        <w:t xml:space="preserve"> relationship between</w:t>
+      </w:r>
+      <w:r>
+        <w:t xml:space="preserve"> average learning time </w:t>
+      </w:r>
+      <w:r>
+        <w:t>and CPU speed</w:t>
+      </w:r>
+      <w:r>
+        <w:t xml:space="preserve">. </w:t>
+      </w:r>
+      <w:r>
+        <w:t>The experiment was carried out on a single system with a set CPU clock speed of around 2.40 GHz, therefore this parameter did not change from trial to trial. The box plot thus fails to provide comparative information.</w:t>
+      </w:r>
+      <w:r>
+        <w:t xml:space="preserve"> </w:t>
+      </w:r>
+      <w:r>
+        <w:rPr>
+          <w:lang w:val="en-DE"/>
+        </w:rPr>
+        <w:t xml:space="preserve">The learning </w:t>
+      </w:r>
+      <w:r>
+        <w:rPr>
+          <w:lang w:val="en-DE"/>
+        </w:rPr>
+        <w:t>times</w:t>
+      </w:r>
+      <w:r>
+        <w:rPr>
+          <w:lang w:val="en-DE"/>
+        </w:rPr>
+        <w:t>, however, remained within a narrow range, suggesting that the hardware configuration was constant and that the tests went well, yielding consistent results.</w:t>
+      </w:r>
+    </w:p>
+    <w:p>
+      <w:pPr>
+        <w:jc w:val="both"/>
+      </w:pPr>
+    </w:p>
+    <w:p>
+      <w:r>
+        <w:rPr>
+          <w:noProof/>
+        </w:rPr>
+        <w:drawing>
+          <wp:inline distT="0" distB="0" distL="0" distR="0" wp14:anchorId="5F6FBF9A" wp14:editId="4EA56988">
+            <wp:extent cx="2984500" cy="1865630"/>
+            <wp:effectExtent l="0" t="0" r="6350" b="1270"/>
+            <wp:docPr id="1538182992" name="Picture 4" descr="A graph with a green line&#10;&#10;AI-generated content may be incorrect."/>
+            <wp:cNvGraphicFramePr>
+              <a:graphicFrameLocks xmlns:a="http://schemas.openxmlformats.org/drawingml/2006/main" noChangeAspect="1"/>
+            </wp:cNvGraphicFramePr>
+            <a:graphic xmlns:a="http://schemas.openxmlformats.org/drawingml/2006/main">
+              <a:graphicData uri="http://schemas.openxmlformats.org/drawingml/2006/picture">
+                <pic:pic xmlns:pic="http://schemas.openxmlformats.org/drawingml/2006/picture">
+                  <pic:nvPicPr>
+                    <pic:cNvPr id="1538182992" name="Picture 4" descr="A graph with a green line&#10;&#10;AI-generated content may be incorrect."/>
+                    <pic:cNvPicPr>
+                      <a:picLocks noChangeAspect="1" noChangeArrowheads="1"/>
+                    </pic:cNvPicPr>
+                  </pic:nvPicPr>
+                  <pic:blipFill>
+                    <a:blip r:embed="rId26" cstate="print">
+                      <a:extLst>
+                        <a:ext uri="{28A0092B-C50C-407E-A947-70E740481C1C}">
+                          <a14:useLocalDpi xmlns:a14="http://schemas.microsoft.com/office/drawing/2010/main" val="0"/>
+                        </a:ext>
+                      </a:extLst>
+                    </a:blip>
+                    <a:srcRect/>
+                    <a:stretch>
+                      <a:fillRect/>
+                    </a:stretch>
+                  </pic:blipFill>
+                  <pic:spPr bwMode="auto">
+                    <a:xfrm>
+                      <a:off x="0" y="0"/>
+                      <a:ext cx="2984500" cy="1865630"/>
+                    </a:xfrm>
+                    <a:prstGeom prst="rect">
+                      <a:avLst/>
+                    </a:prstGeom>
+                    <a:noFill/>
+                    <a:ln>
+                      <a:noFill/>
+                    </a:ln>
+                  </pic:spPr>
+                </pic:pic>
+              </a:graphicData>
+            </a:graphic>
+          </wp:inline>
+        </w:drawing>
+      </w:r>
+      <w:r>
+        <w:rPr>
+          <w:i/>
+          <w:iCs/>
+          <w:sz w:val="18"/>
+          <w:szCs w:val="18"/>
+        </w:rPr>
+        <w:t>Figure.</w:t>
+      </w:r>
+      <w:r>
+        <w:rPr>
+          <w:i/>
+          <w:iCs/>
+          <w:sz w:val="18"/>
+          <w:szCs w:val="18"/>
+        </w:rPr>
+        <w:t>4.2</w:t>
+      </w:r>
+      <w:r>
+        <w:rPr>
+          <w:i/>
+          <w:iCs/>
+          <w:sz w:val="18"/>
+          <w:szCs w:val="18"/>
+        </w:rPr>
+        <w:t xml:space="preserve">: Learning time vs CPU </w:t>
+      </w:r>
+      <w:r>
+        <w:rPr>
+          <w:i/>
+          <w:iCs/>
+          <w:sz w:val="18"/>
+          <w:szCs w:val="18"/>
+        </w:rPr>
+        <w:t>Speed</w:t>
+      </w:r>
+    </w:p>
+    <w:p/>
+    <w:p>
+      <w:pPr>
+        <w:jc w:val="both"/>
+        <w:rPr>
+          <w:b/>
+          <w:bCs/>
+          <w:i/>
+          <w:iCs/>
+        </w:rPr>
+      </w:pPr>
+      <w:r>
+        <w:rPr>
+          <w:b/>
+          <w:bCs/>
+          <w:i/>
+          <w:iCs/>
+        </w:rPr>
+        <w:t>4.3.  Learning Time vs</w:t>
+      </w:r>
+      <w:r>
+        <w:rPr>
+          <w:b/>
+          <w:bCs/>
+          <w:i/>
+          <w:iCs/>
+        </w:rPr>
+        <w:t xml:space="preserve"> .NET Version</w:t>
+      </w:r>
+    </w:p>
+    <w:p>
+      <w:pPr>
+        <w:jc w:val="both"/>
+        <w:rPr>
+          <w:lang w:val="en-DE"/>
+        </w:rPr>
+      </w:pPr>
+      <w:r>
+        <w:t>Fig</w:t>
+      </w:r>
+      <w:r>
+        <w:t>.</w:t>
+      </w:r>
+      <w:r>
+        <w:t xml:space="preserve"> 4.3 </w:t>
+      </w:r>
+      <w:r>
+        <w:t xml:space="preserve">show that </w:t>
+      </w:r>
+      <w:r>
+        <w:rPr>
+          <w:lang w:val="en-DE"/>
+        </w:rPr>
+        <w:t>b</w:t>
+      </w:r>
+      <w:r>
+        <w:rPr>
+          <w:lang w:val="en-DE"/>
+        </w:rPr>
+        <w:t xml:space="preserve">oth.NET 8.0.14 and.NET 9.0.3 had </w:t>
+      </w:r>
+      <w:r>
+        <w:rPr>
+          <w:lang w:val="en-DE"/>
+        </w:rPr>
+        <w:t xml:space="preserve">close </w:t>
+      </w:r>
+      <w:r>
+        <w:rPr>
+          <w:lang w:val="en-DE"/>
+        </w:rPr>
+        <w:t xml:space="preserve">median learning </w:t>
+      </w:r>
+      <w:r>
+        <w:rPr>
+          <w:lang w:val="en-DE"/>
+        </w:rPr>
+        <w:t>times</w:t>
+      </w:r>
+      <w:r>
+        <w:rPr>
+          <w:lang w:val="en-DE"/>
+        </w:rPr>
+        <w:t xml:space="preserve">, indicating that their overall performance was </w:t>
+      </w:r>
+      <w:r>
+        <w:rPr>
+          <w:lang w:val="en-DE"/>
+        </w:rPr>
+        <w:t xml:space="preserve">similar. </w:t>
+      </w:r>
+      <w:r>
+        <w:rPr>
+          <w:lang w:val="en-DE"/>
+        </w:rPr>
+        <w:t>But the results for.NET 8.0.14 were more reliable, with the majority of values remaining in the medi</w:t>
+      </w:r>
+      <w:r>
+        <w:rPr>
+          <w:lang w:val="en-DE"/>
+        </w:rPr>
+        <w:t>an</w:t>
+      </w:r>
+      <w:r>
+        <w:rPr>
+          <w:lang w:val="en-DE"/>
+        </w:rPr>
+        <w:t xml:space="preserve"> range. However, the performance of.NET 9.0.3 varied significantly, which might be due to the way the updated version manages memory or other background operations.</w:t>
+      </w:r>
+    </w:p>
+    <w:p>
+      <w:pPr>
+        <w:jc w:val="both"/>
+        <w:rPr>
+          <w:b/>
+          <w:bCs/>
+          <w:i/>
+          <w:iCs/>
+        </w:rPr>
+      </w:pPr>
+      <w:r>
+        <w:rPr>
+          <w:noProof/>
+        </w:rPr>
+        <w:drawing>
+          <wp:inline distT="0" distB="0" distL="0" distR="0" wp14:anchorId="3D001898" wp14:editId="32DA9BAA">
+            <wp:extent cx="2984500" cy="1865630"/>
+            <wp:effectExtent l="0" t="0" r="6350" b="1270"/>
+            <wp:docPr id="1636807271" name="Picture 5" descr="A graph of a graph showing a comparison between a learning and a net version&#10;&#10;AI-generated content may be incorrect."/>
+            <wp:cNvGraphicFramePr>
+              <a:graphicFrameLocks xmlns:a="http://schemas.openxmlformats.org/drawingml/2006/main" noChangeAspect="1"/>
+            </wp:cNvGraphicFramePr>
+            <a:graphic xmlns:a="http://schemas.openxmlformats.org/drawingml/2006/main">
+              <a:graphicData uri="http://schemas.openxmlformats.org/drawingml/2006/picture">
+                <pic:pic xmlns:pic="http://schemas.openxmlformats.org/drawingml/2006/picture">
+                  <pic:nvPicPr>
+                    <pic:cNvPr id="1636807271" name="Picture 5" descr="A graph of a graph showing a comparison between a learning and a net version&#10;&#10;AI-generated content may be incorrect."/>
                     <pic:cNvPicPr>
                       <a:picLocks noChangeAspect="1" noChangeArrowheads="1"/>
                     </pic:cNvPicPr>
@@ -6180,344 +6439,6 @@
         </w:drawing>
       </w:r>
     </w:p>
-    <w:p>
-      <w:r>
-        <w:rPr>
-          <w:i/>
-          <w:iCs/>
-          <w:sz w:val="18"/>
-          <w:szCs w:val="18"/>
-        </w:rPr>
-        <w:t>Figure</w:t>
-      </w:r>
-      <w:r>
-        <w:rPr>
-          <w:i/>
-          <w:iCs/>
-          <w:sz w:val="18"/>
-          <w:szCs w:val="18"/>
-        </w:rPr>
-        <w:t xml:space="preserve"> 4.1</w:t>
-      </w:r>
-      <w:r>
-        <w:rPr>
-          <w:i/>
-          <w:iCs/>
-          <w:sz w:val="18"/>
-          <w:szCs w:val="18"/>
-        </w:rPr>
-        <w:t>.: Learning time vs CPU Cores</w:t>
-      </w:r>
-    </w:p>
-    <w:p>
-      <w:pPr>
-        <w:jc w:val="both"/>
-        <w:rPr>
-          <w:highlight w:val="red"/>
-        </w:rPr>
-      </w:pPr>
-    </w:p>
-    <w:p>
-      <w:pPr>
-        <w:pStyle w:val="Heading2"/>
-        <w:numPr>
-          <w:ilvl w:val="0"/>
-          <w:numId w:val="0"/>
-        </w:numPr>
-        <w:rPr>
-          <w:b/>
-          <w:bCs/>
-          <w:noProof w:val="0"/>
-        </w:rPr>
-      </w:pPr>
-      <w:bookmarkStart w:id="2" w:name="_Hlk193912395"/>
-      <w:r>
-        <w:rPr>
-          <w:b/>
-          <w:bCs/>
-          <w:noProof w:val="0"/>
-        </w:rPr>
-        <w:t>4.2.  Learning Time vs CPU Speed</w:t>
-      </w:r>
-      <w:bookmarkEnd w:id="2"/>
-      <w:r>
-        <w:rPr>
-          <w:b/>
-          <w:bCs/>
-          <w:noProof w:val="0"/>
-        </w:rPr>
-        <w:t xml:space="preserve">  </w:t>
-      </w:r>
-    </w:p>
-    <w:p>
-      <w:pPr>
-        <w:jc w:val="both"/>
-      </w:pPr>
-      <w:r>
-        <w:t>Th</w:t>
-      </w:r>
-      <w:r>
-        <w:t>e</w:t>
-      </w:r>
-      <w:r>
-        <w:t xml:space="preserve"> chart </w:t>
-      </w:r>
-      <w:r>
-        <w:t>in Fig</w:t>
-      </w:r>
-      <w:r>
-        <w:t>.</w:t>
-      </w:r>
-      <w:r>
-        <w:t xml:space="preserve"> 4.2 </w:t>
-      </w:r>
-      <w:r>
-        <w:t>shows</w:t>
-      </w:r>
-      <w:r>
-        <w:t xml:space="preserve"> the</w:t>
-      </w:r>
-      <w:r>
-        <w:t xml:space="preserve"> relationship between</w:t>
-      </w:r>
-      <w:r>
-        <w:t xml:space="preserve"> average learning time </w:t>
-      </w:r>
-      <w:r>
-        <w:t>and CPU speed, grouped into distinct GHz ranges. All the experiment was run on a machine with a CPU speed range falling between 2.40-2.43 GHz and got this learning time data. Though the limitation of running the experiment on one single machine’s CPU frequency doesn’t show the deeper trend analysis, this graph shows the consistency of the hardware environment.</w:t>
-      </w:r>
-    </w:p>
-    <w:p>
-      <w:pPr>
-        <w:jc w:val="both"/>
-      </w:pPr>
-    </w:p>
-    <w:p>
-      <w:r>
-        <w:drawing>
-          <wp:inline distT="0" distB="0" distL="0" distR="0" wp14:anchorId="3362F9D4" wp14:editId="3137ECF7">
-            <wp:extent cx="2984500" cy="1865630"/>
-            <wp:effectExtent l="0" t="0" r="6350" b="1270"/>
-            <wp:docPr id="358951864" name="Picture 19" descr="A graph with green and white lines&#10;&#10;AI-generated content may be incorrect."/>
-            <wp:cNvGraphicFramePr>
-              <a:graphicFrameLocks xmlns:a="http://schemas.openxmlformats.org/drawingml/2006/main" noChangeAspect="1"/>
-            </wp:cNvGraphicFramePr>
-            <a:graphic xmlns:a="http://schemas.openxmlformats.org/drawingml/2006/main">
-              <a:graphicData uri="http://schemas.openxmlformats.org/drawingml/2006/picture">
-                <pic:pic xmlns:pic="http://schemas.openxmlformats.org/drawingml/2006/picture">
-                  <pic:nvPicPr>
-                    <pic:cNvPr id="358951864" name="Picture 19" descr="A graph with green and white lines&#10;&#10;AI-generated content may be incorrect."/>
-                    <pic:cNvPicPr>
-                      <a:picLocks noChangeAspect="1" noChangeArrowheads="1"/>
-                    </pic:cNvPicPr>
-                  </pic:nvPicPr>
-                  <pic:blipFill>
-                    <a:blip r:embed="rId28" cstate="print">
-                      <a:extLst>
-                        <a:ext uri="{28A0092B-C50C-407E-A947-70E740481C1C}">
-                          <a14:useLocalDpi xmlns:a14="http://schemas.microsoft.com/office/drawing/2010/main" val="0"/>
-                        </a:ext>
-                      </a:extLst>
-                    </a:blip>
-                    <a:srcRect/>
-                    <a:stretch>
-                      <a:fillRect/>
-                    </a:stretch>
-                  </pic:blipFill>
-                  <pic:spPr bwMode="auto">
-                    <a:xfrm>
-                      <a:off x="0" y="0"/>
-                      <a:ext cx="2984500" cy="1865630"/>
-                    </a:xfrm>
-                    <a:prstGeom prst="rect">
-                      <a:avLst/>
-                    </a:prstGeom>
-                    <a:noFill/>
-                    <a:ln>
-                      <a:noFill/>
-                    </a:ln>
-                  </pic:spPr>
-                </pic:pic>
-              </a:graphicData>
-            </a:graphic>
-          </wp:inline>
-        </w:drawing>
-      </w:r>
-      <w:r>
-        <w:rPr>
-          <w:i/>
-          <w:iCs/>
-          <w:sz w:val="18"/>
-          <w:szCs w:val="18"/>
-        </w:rPr>
-        <w:t>Figure.</w:t>
-      </w:r>
-      <w:r>
-        <w:rPr>
-          <w:i/>
-          <w:iCs/>
-          <w:sz w:val="18"/>
-          <w:szCs w:val="18"/>
-        </w:rPr>
-        <w:t>4.2</w:t>
-      </w:r>
-      <w:r>
-        <w:rPr>
-          <w:i/>
-          <w:iCs/>
-          <w:sz w:val="18"/>
-          <w:szCs w:val="18"/>
-        </w:rPr>
-        <w:t xml:space="preserve">: Learning time vs CPU </w:t>
-      </w:r>
-      <w:r>
-        <w:rPr>
-          <w:i/>
-          <w:iCs/>
-          <w:sz w:val="18"/>
-          <w:szCs w:val="18"/>
-        </w:rPr>
-        <w:t>Speed</w:t>
-      </w:r>
-    </w:p>
-    <w:p/>
-    <w:p>
-      <w:pPr>
-        <w:jc w:val="both"/>
-        <w:rPr>
-          <w:b/>
-          <w:bCs/>
-          <w:i/>
-          <w:iCs/>
-        </w:rPr>
-      </w:pPr>
-      <w:r>
-        <w:rPr>
-          <w:b/>
-          <w:bCs/>
-          <w:i/>
-          <w:iCs/>
-        </w:rPr>
-        <w:t>4.3.  Learning Time vs</w:t>
-      </w:r>
-      <w:r>
-        <w:rPr>
-          <w:b/>
-          <w:bCs/>
-          <w:i/>
-          <w:iCs/>
-        </w:rPr>
-        <w:t xml:space="preserve"> .NET Version</w:t>
-      </w:r>
-    </w:p>
-    <w:p>
-      <w:pPr>
-        <w:jc w:val="both"/>
-        <w:rPr>
-          <w:b/>
-          <w:bCs/>
-          <w:i/>
-          <w:iCs/>
-        </w:rPr>
-      </w:pPr>
-      <w:r>
-        <w:t>Th</w:t>
-      </w:r>
-      <w:r>
-        <w:t>e</w:t>
-      </w:r>
-      <w:r>
-        <w:t xml:space="preserve"> chart </w:t>
-      </w:r>
-      <w:r>
-        <w:t>in Fig</w:t>
-      </w:r>
-      <w:r>
-        <w:t>.</w:t>
-      </w:r>
-      <w:r>
-        <w:t xml:space="preserve"> 4.3 </w:t>
-      </w:r>
-      <w:r>
-        <w:t xml:space="preserve">compares the average learning time with different .NET versions. .NET runtime version 9.0.3 </w:t>
-      </w:r>
-      <w:r>
-        <w:t xml:space="preserve">showed better performance with a lower average learning time (~ 1150s) </w:t>
-      </w:r>
-      <w:r>
-        <w:t>compared</w:t>
-      </w:r>
-      <w:r>
-        <w:t xml:space="preserve"> to .NET 8.0.14 (~1390s) average learning time with respect to the number of CPU cores used is shown in the bar plot.  </w:t>
-      </w:r>
-    </w:p>
-    <w:p>
-      <w:pPr>
-        <w:jc w:val="both"/>
-        <w:rPr>
-          <w:b/>
-          <w:bCs/>
-          <w:i/>
-          <w:iCs/>
-        </w:rPr>
-      </w:pPr>
-      <w:r>
-        <w:rPr>
-          <w:b/>
-          <w:bCs/>
-          <w:i/>
-          <w:iCs/>
-        </w:rPr>
-        <w:drawing>
-          <wp:inline distT="0" distB="0" distL="0" distR="0" wp14:anchorId="00FE3F84" wp14:editId="2B74C852">
-            <wp:extent cx="2979420" cy="1858010"/>
-            <wp:effectExtent l="0" t="0" r="0" b="8890"/>
-            <wp:docPr id="1751569877" name="Picture 5"/>
-            <wp:cNvGraphicFramePr>
-              <a:graphicFrameLocks xmlns:a="http://schemas.openxmlformats.org/drawingml/2006/main" noChangeAspect="1"/>
-            </wp:cNvGraphicFramePr>
-            <a:graphic xmlns:a="http://schemas.openxmlformats.org/drawingml/2006/main">
-              <a:graphicData uri="http://schemas.openxmlformats.org/drawingml/2006/picture">
-                <pic:pic xmlns:pic="http://schemas.openxmlformats.org/drawingml/2006/picture">
-                  <pic:nvPicPr>
-                    <pic:cNvPr id="0" name="Picture 4"/>
-                    <pic:cNvPicPr>
-                      <a:picLocks noChangeAspect="1" noChangeArrowheads="1"/>
-                    </pic:cNvPicPr>
-                  </pic:nvPicPr>
-                  <pic:blipFill>
-                    <a:blip r:embed="rId29" cstate="print">
-                      <a:extLst>
-                        <a:ext uri="{28A0092B-C50C-407E-A947-70E740481C1C}">
-                          <a14:useLocalDpi xmlns:a14="http://schemas.microsoft.com/office/drawing/2010/main" val="0"/>
-                        </a:ext>
-                      </a:extLst>
-                    </a:blip>
-                    <a:srcRect/>
-                    <a:stretch>
-                      <a:fillRect/>
-                    </a:stretch>
-                  </pic:blipFill>
-                  <pic:spPr bwMode="auto">
-                    <a:xfrm>
-                      <a:off x="0" y="0"/>
-                      <a:ext cx="2979420" cy="1858010"/>
-                    </a:xfrm>
-                    <a:prstGeom prst="rect">
-                      <a:avLst/>
-                    </a:prstGeom>
-                    <a:noFill/>
-                    <a:ln>
-                      <a:noFill/>
-                    </a:ln>
-                  </pic:spPr>
-                </pic:pic>
-              </a:graphicData>
-            </a:graphic>
-          </wp:inline>
-        </w:drawing>
-      </w:r>
-    </w:p>
     <w:p/>
     <w:p>
       <w:r>
@@ -6654,6 +6575,9 @@
     <w:p>
       <w:pPr>
         <w:jc w:val="both"/>
+        <w:rPr>
+          <w:lang w:val="en-DE"/>
+        </w:rPr>
       </w:pPr>
       <w:r>
         <w:t xml:space="preserve">Key performance metrics such as learning time, RAM usage, CPU speed, and runtime versions were logged in CSV outputs. </w:t>
@@ -6683,25 +6607,34 @@
         <w:t xml:space="preserve"> of parallelization.</w:t>
       </w:r>
       <w:r>
-        <w:t xml:space="preserve"> Also, the comparison </w:t>
-      </w:r>
-      <w:r>
-        <w:t>among</w:t>
-      </w:r>
-      <w:r>
-        <w:t xml:space="preserve"> dotnet versions showed </w:t>
-      </w:r>
-      <w:r>
-        <w:t>significant</w:t>
-      </w:r>
-      <w:r>
-        <w:t xml:space="preserve"> runtime optimizations, where .NET 9.0.3 outperformed .NET 8.0.14 in most </w:t>
-      </w:r>
-      <w:r>
-        <w:t>configurations.</w:t>
-      </w:r>
-      <w:r>
-        <w:t xml:space="preserve"> IExperiment interface which uses </w:t>
+        <w:t xml:space="preserve"> </w:t>
+      </w:r>
+      <w:r>
+        <w:rPr>
+          <w:lang w:val="en-DE"/>
+        </w:rPr>
+        <w:t xml:space="preserve">Additionally, a comparison of the various.NET versions revealed comparable overall performance; however, 8.0.14 produced more reliable and consistent results, whereas 9.0.3 produced greater unpredictability, maybe as a result of internal runtime </w:t>
+      </w:r>
+      <w:r>
+        <w:rPr>
+          <w:lang w:val="en-DE"/>
+        </w:rPr>
+        <w:t>behaviour</w:t>
+      </w:r>
+      <w:r>
+        <w:rPr>
+          <w:lang w:val="en-DE"/>
+        </w:rPr>
+        <w:t>.</w:t>
+      </w:r>
+      <w:r>
+        <w:rPr>
+          <w:lang w:val="en-DE"/>
+        </w:rPr>
+        <w:t xml:space="preserve"> </w:t>
+      </w:r>
+      <w:r>
+        <w:t xml:space="preserve">IExperiment interface which uses </w:t>
       </w:r>
       <w:r>
         <w:t>reflection</w:t>
@@ -6805,7 +6738,7 @@
             </w:rPr>
             <w:t xml:space="preserve"> </w:t>
           </w:r>
-          <w:hyperlink r:id="rId30" w:history="1">
+          <w:hyperlink r:id="rId28" w:history="1">
             <w:r>
               <w:rPr>
                 <w:rStyle w:val="Hyperlink"/>
@@ -6917,7 +6850,6 @@
               <w:kern w:val="2"/>
               <w14:ligatures w14:val="standardContextual"/>
             </w:rPr>
-            <w:lastRenderedPageBreak/>
             <w:t>[6] Jeff Hawkins and Dileep George, "Hierarchical Temporal Memory", 2009</w:t>
           </w:r>
         </w:p>
@@ -6975,7 +6907,23 @@
               <w:kern w:val="2"/>
               <w14:ligatures w14:val="standardContextual"/>
             </w:rPr>
-            <w:t xml:space="preserve">[9] JamesLikesBrains Breaking down how a single HTM Neuron works? - Community - HTM Forum (numenta.org) </w:t>
+            <w:t>[</w:t>
+          </w:r>
+          <w:r>
+            <w:rPr>
+              <w:rFonts w:eastAsia="Aptos"/>
+              <w:kern w:val="2"/>
+              <w14:ligatures w14:val="standardContextual"/>
+            </w:rPr>
+            <w:t>9</w:t>
+          </w:r>
+          <w:r>
+            <w:rPr>
+              <w:rFonts w:eastAsia="Aptos"/>
+              <w:kern w:val="2"/>
+              <w14:ligatures w14:val="standardContextual"/>
+            </w:rPr>
+            <w:t>] https://www.vectorstock.com/royalty-free-vector/neuron-anatomical-structure-medical-education-vector-48845108</w:t>
           </w:r>
         </w:p>
         <w:p>
@@ -6994,7 +6942,23 @@
               <w:kern w:val="2"/>
               <w14:ligatures w14:val="standardContextual"/>
             </w:rPr>
-            <w:t>[10] Neocortical Layers (umn.edu)</w:t>
+            <w:t>[1</w:t>
+          </w:r>
+          <w:r>
+            <w:rPr>
+              <w:rFonts w:eastAsia="Aptos"/>
+              <w:kern w:val="2"/>
+              <w14:ligatures w14:val="standardContextual"/>
+            </w:rPr>
+            <w:t>0</w:t>
+          </w:r>
+          <w:r>
+            <w:rPr>
+              <w:rFonts w:eastAsia="Aptos"/>
+              <w:kern w:val="2"/>
+              <w14:ligatures w14:val="standardContextual"/>
+            </w:rPr>
+            <w:t>] "Yuwei Cui, Subutai Ahmad, Jeff Hawkins" https://www.biorxiv.org/content/10.1101/085035v1.full</w:t>
           </w:r>
         </w:p>
         <w:p>
@@ -7013,64 +6977,7 @@
               <w:kern w:val="2"/>
               <w14:ligatures w14:val="standardContextual"/>
             </w:rPr>
-            <w:t>[11] https://www.vectorstock.com/royalty-free-vector/neuron-anatomical-structure-medical-education-vector-48845108</w:t>
-          </w:r>
-        </w:p>
-        <w:p>
-          <w:pPr>
-            <w:spacing w:after="160" w:line="259" w:lineRule="auto"/>
-            <w:jc w:val="left"/>
-            <w:rPr>
-              <w:rFonts w:eastAsia="Aptos"/>
-              <w:kern w:val="2"/>
-              <w14:ligatures w14:val="standardContextual"/>
-            </w:rPr>
-          </w:pPr>
-          <w:r>
-            <w:rPr>
-              <w:rFonts w:eastAsia="Aptos"/>
-              <w:kern w:val="2"/>
-              <w14:ligatures w14:val="standardContextual"/>
-            </w:rPr>
-            <w:t>[12] "Yuwei Cui, Subutai Ahmad, Jeff Hawkins" https://www.biorxiv.org/content/10.1101/085035v1.full</w:t>
-          </w:r>
-        </w:p>
-        <w:p>
-          <w:pPr>
-            <w:spacing w:after="160" w:line="259" w:lineRule="auto"/>
-            <w:jc w:val="left"/>
-            <w:rPr>
-              <w:rFonts w:eastAsia="Aptos"/>
-              <w:kern w:val="2"/>
-              <w14:ligatures w14:val="standardContextual"/>
-            </w:rPr>
-          </w:pPr>
-          <w:r>
-            <w:rPr>
-              <w:rFonts w:eastAsia="Aptos"/>
-              <w:kern w:val="2"/>
-              <w14:ligatures w14:val="standardContextual"/>
-            </w:rPr>
-            <w:t>[13] Each distal dendrite segment of a cell has synapse connections Download Scientific Diagram (researchgate.net)</w:t>
-          </w:r>
-        </w:p>
-        <w:p>
-          <w:pPr>
-            <w:spacing w:after="160" w:line="259" w:lineRule="auto"/>
-            <w:jc w:val="left"/>
-            <w:rPr>
-              <w:rFonts w:eastAsia="Aptos"/>
-              <w:kern w:val="2"/>
-              <w14:ligatures w14:val="standardContextual"/>
-            </w:rPr>
-          </w:pPr>
-          <w:r>
-            <w:rPr>
-              <w:rFonts w:eastAsia="Aptos"/>
-              <w:kern w:val="2"/>
-              <w14:ligatures w14:val="standardContextual"/>
-            </w:rPr>
-            <w:t xml:space="preserve">[14] K. Hole, "The HTM Learning Algorithm. In: Anti-fragile ICT Systems. Simula SpringerBriefs on Computing, vol 1," 2016. [Online]. Available: </w:t>
+            <w:t>[1</w:t>
           </w:r>
           <w:r>
             <w:rPr>
@@ -7078,26 +6985,15 @@
               <w:kern w:val="2"/>
               <w14:ligatures w14:val="standardContextual"/>
             </w:rPr>
-            <w:t>https://link.springer.com/chapter/10.1007/978-3-319-30070-2_11.</w:t>
+            <w:t>1</w:t>
           </w:r>
-        </w:p>
-        <w:p>
-          <w:pPr>
-            <w:spacing w:after="160" w:line="259" w:lineRule="auto"/>
-            <w:jc w:val="left"/>
-            <w:rPr>
-              <w:rFonts w:eastAsia="Aptos"/>
-              <w:kern w:val="2"/>
-              <w14:ligatures w14:val="standardContextual"/>
-            </w:rPr>
-          </w:pPr>
           <w:r>
             <w:rPr>
               <w:rFonts w:eastAsia="Aptos"/>
               <w:kern w:val="2"/>
               <w14:ligatures w14:val="standardContextual"/>
             </w:rPr>
-            <w:t xml:space="preserve">[15] S. A. J. Hawkins, "Why neurons have thousands of synapses, a theory of sequence memory in </w:t>
+            <w:t xml:space="preserve">] S. A. J. Hawkins, "Why neurons have thousands of synapses, a theory of sequence memory in </w:t>
           </w:r>
           <w:r>
             <w:rPr>
@@ -7134,7 +7030,23 @@
               <w:kern w:val="2"/>
               <w14:ligatures w14:val="standardContextual"/>
             </w:rPr>
-            <w:t>[16] Guy-Evans, "Neurons (Nerve Cells) Structure, Function &amp; Types," 2023. [Online]. Available: https://simplypsychology.org/neuron.html.</w:t>
+            <w:t>[1</w:t>
+          </w:r>
+          <w:r>
+            <w:rPr>
+              <w:rFonts w:eastAsia="Aptos"/>
+              <w:kern w:val="2"/>
+              <w14:ligatures w14:val="standardContextual"/>
+            </w:rPr>
+            <w:t>2</w:t>
+          </w:r>
+          <w:r>
+            <w:rPr>
+              <w:rFonts w:eastAsia="Aptos"/>
+              <w:kern w:val="2"/>
+              <w14:ligatures w14:val="standardContextual"/>
+            </w:rPr>
+            <w:t>] Guy-Evans, "Neurons (Nerve Cells) Structure, Function &amp; Types," 2023. [Online]. Available: https://simplypsychology.org/neuron.html.</w:t>
           </w:r>
         </w:p>
       </w:sdtContent>
@@ -7391,6 +7303,7 @@
           </w:pPr>
           <w:r>
             <w:rPr>
+              <w:noProof/>
               <w:lang w:eastAsia="en-CA"/>
             </w:rPr>
             <w:drawing>
@@ -8105,6 +8018,119 @@
     </w:lvl>
   </w:abstractNum>
   <w:abstractNum w:abstractNumId="5" w15:restartNumberingAfterBreak="0">
+    <w:nsid w:val="3EED4E8C"/>
+    <w:multiLevelType w:val="multilevel"/>
+    <w:tmpl w:val="280A4DD6"/>
+    <w:lvl w:ilvl="0">
+      <w:start w:val="1"/>
+      <w:numFmt w:val="decimal"/>
+      <w:lvlText w:val="%1."/>
+      <w:lvlJc w:val="left"/>
+      <w:pPr>
+        <w:ind w:left="468" w:hanging="468"/>
+      </w:pPr>
+      <w:rPr>
+        <w:rFonts w:hint="default"/>
+      </w:rPr>
+    </w:lvl>
+    <w:lvl w:ilvl="1">
+      <w:start w:val="1"/>
+      <w:numFmt w:val="decimal"/>
+      <w:lvlText w:val="%1.%2."/>
+      <w:lvlJc w:val="left"/>
+      <w:pPr>
+        <w:ind w:left="468" w:hanging="468"/>
+      </w:pPr>
+      <w:rPr>
+        <w:rFonts w:hint="default"/>
+      </w:rPr>
+    </w:lvl>
+    <w:lvl w:ilvl="2">
+      <w:start w:val="6"/>
+      <w:numFmt w:val="decimal"/>
+      <w:lvlText w:val="%1.%2.%3."/>
+      <w:lvlJc w:val="left"/>
+      <w:pPr>
+        <w:ind w:left="720" w:hanging="720"/>
+      </w:pPr>
+      <w:rPr>
+        <w:rFonts w:hint="default"/>
+      </w:rPr>
+    </w:lvl>
+    <w:lvl w:ilvl="3">
+      <w:start w:val="1"/>
+      <w:numFmt w:val="decimalZero"/>
+      <w:lvlText w:val="%1.%2.%3.%4."/>
+      <w:lvlJc w:val="left"/>
+      <w:pPr>
+        <w:ind w:left="720" w:hanging="720"/>
+      </w:pPr>
+      <w:rPr>
+        <w:rFonts w:hint="default"/>
+      </w:rPr>
+    </w:lvl>
+    <w:lvl w:ilvl="4">
+      <w:start w:val="1"/>
+      <w:numFmt w:val="decimal"/>
+      <w:lvlText w:val="%1.%2.%3.%4.%5."/>
+      <w:lvlJc w:val="left"/>
+      <w:pPr>
+        <w:ind w:left="1080" w:hanging="1080"/>
+      </w:pPr>
+      <w:rPr>
+        <w:rFonts w:hint="default"/>
+      </w:rPr>
+    </w:lvl>
+    <w:lvl w:ilvl="5">
+      <w:start w:val="1"/>
+      <w:numFmt w:val="decimal"/>
+      <w:lvlText w:val="%1.%2.%3.%4.%5.%6."/>
+      <w:lvlJc w:val="left"/>
+      <w:pPr>
+        <w:ind w:left="1080" w:hanging="1080"/>
+      </w:pPr>
+      <w:rPr>
+        <w:rFonts w:hint="default"/>
+      </w:rPr>
+    </w:lvl>
+    <w:lvl w:ilvl="6">
+      <w:start w:val="1"/>
+      <w:numFmt w:val="decimal"/>
+      <w:lvlText w:val="%1.%2.%3.%4.%5.%6.%7."/>
+      <w:lvlJc w:val="left"/>
+      <w:pPr>
+        <w:ind w:left="1080" w:hanging="1080"/>
+      </w:pPr>
+      <w:rPr>
+        <w:rFonts w:hint="default"/>
+      </w:rPr>
+    </w:lvl>
+    <w:lvl w:ilvl="7">
+      <w:start w:val="1"/>
+      <w:numFmt w:val="decimal"/>
+      <w:lvlText w:val="%1.%2.%3.%4.%5.%6.%7.%8."/>
+      <w:lvlJc w:val="left"/>
+      <w:pPr>
+        <w:ind w:left="1440" w:hanging="1440"/>
+      </w:pPr>
+      <w:rPr>
+        <w:rFonts w:hint="default"/>
+      </w:rPr>
+    </w:lvl>
+    <w:lvl w:ilvl="8">
+      <w:start w:val="1"/>
+      <w:numFmt w:val="decimal"/>
+      <w:lvlText w:val="%1.%2.%3.%4.%5.%6.%7.%8.%9."/>
+      <w:lvlJc w:val="left"/>
+      <w:pPr>
+        <w:ind w:left="1440" w:hanging="1440"/>
+      </w:pPr>
+      <w:rPr>
+        <w:rFonts w:hint="default"/>
+      </w:rPr>
+    </w:lvl>
+  </w:abstractNum>
+  <w:abstractNum w:abstractNumId="6" w15:restartNumberingAfterBreak="0">
     <w:nsid w:val="44FC4326"/>
     <w:multiLevelType w:val="multilevel"/>
     <w:tmpl w:val="B130F964"/>
@@ -8217,7 +8243,7 @@
       </w:rPr>
     </w:lvl>
   </w:abstractNum>
-  <w:abstractNum w:abstractNumId="6" w15:restartNumberingAfterBreak="0">
+  <w:abstractNum w:abstractNumId="7" w15:restartNumberingAfterBreak="0">
     <w:nsid w:val="493C3F76"/>
     <w:multiLevelType w:val="hybridMultilevel"/>
     <w:tmpl w:val="9A9E418C"/>
@@ -8320,7 +8346,7 @@
       </w:pPr>
     </w:lvl>
   </w:abstractNum>
-  <w:abstractNum w:abstractNumId="7" w15:restartNumberingAfterBreak="0">
+  <w:abstractNum w:abstractNumId="8" w15:restartNumberingAfterBreak="0">
     <w:nsid w:val="4B9148C8"/>
     <w:multiLevelType w:val="multilevel"/>
     <w:tmpl w:val="033421AC"/>
@@ -8406,7 +8432,7 @@
       </w:pPr>
     </w:lvl>
   </w:abstractNum>
-  <w:abstractNum w:abstractNumId="8" w15:restartNumberingAfterBreak="0">
+  <w:abstractNum w:abstractNumId="9" w15:restartNumberingAfterBreak="0">
     <w:nsid w:val="4C273A64"/>
     <w:multiLevelType w:val="multilevel"/>
     <w:tmpl w:val="23167DD0"/>
@@ -8492,7 +8518,7 @@
       </w:pPr>
     </w:lvl>
   </w:abstractNum>
-  <w:abstractNum w:abstractNumId="9" w15:restartNumberingAfterBreak="0">
+  <w:abstractNum w:abstractNumId="10" w15:restartNumberingAfterBreak="0">
     <w:nsid w:val="52CA544A"/>
     <w:multiLevelType w:val="singleLevel"/>
     <w:tmpl w:val="AED6D67E"/>
@@ -8519,7 +8545,7 @@
       </w:rPr>
     </w:lvl>
   </w:abstractNum>
-  <w:abstractNum w:abstractNumId="10" w15:restartNumberingAfterBreak="0">
+  <w:abstractNum w:abstractNumId="11" w15:restartNumberingAfterBreak="0">
     <w:nsid w:val="583109F7"/>
     <w:multiLevelType w:val="multilevel"/>
     <w:tmpl w:val="2200A50E"/>
@@ -8632,7 +8658,7 @@
       </w:rPr>
     </w:lvl>
   </w:abstractNum>
-  <w:abstractNum w:abstractNumId="11" w15:restartNumberingAfterBreak="0">
+  <w:abstractNum w:abstractNumId="12" w15:restartNumberingAfterBreak="0">
     <w:nsid w:val="590440EF"/>
     <w:multiLevelType w:val="hybridMultilevel"/>
     <w:tmpl w:val="80D292F2"/>
@@ -8721,7 +8747,7 @@
       </w:pPr>
     </w:lvl>
   </w:abstractNum>
-  <w:abstractNum w:abstractNumId="12" w15:restartNumberingAfterBreak="0">
+  <w:abstractNum w:abstractNumId="13" w15:restartNumberingAfterBreak="0">
     <w:nsid w:val="5D153AA5"/>
     <w:multiLevelType w:val="multilevel"/>
     <w:tmpl w:val="784C98AE"/>
@@ -8808,7 +8834,7 @@
       </w:pPr>
     </w:lvl>
   </w:abstractNum>
-  <w:abstractNum w:abstractNumId="13" w15:restartNumberingAfterBreak="0">
+  <w:abstractNum w:abstractNumId="14" w15:restartNumberingAfterBreak="0">
     <w:nsid w:val="678944F1"/>
     <w:multiLevelType w:val="multilevel"/>
     <w:tmpl w:val="34EA7086"/>
@@ -8921,7 +8947,7 @@
       </w:rPr>
     </w:lvl>
   </w:abstractNum>
-  <w:abstractNum w:abstractNumId="14" w15:restartNumberingAfterBreak="0">
+  <w:abstractNum w:abstractNumId="15" w15:restartNumberingAfterBreak="0">
     <w:nsid w:val="6C402C58"/>
     <w:multiLevelType w:val="hybridMultilevel"/>
     <w:tmpl w:val="9A1CA078"/>
@@ -9066,7 +9092,7 @@
       </w:rPr>
     </w:lvl>
   </w:abstractNum>
-  <w:abstractNum w:abstractNumId="15" w15:restartNumberingAfterBreak="0">
+  <w:abstractNum w:abstractNumId="16" w15:restartNumberingAfterBreak="0">
     <w:nsid w:val="6CD32DA8"/>
     <w:multiLevelType w:val="singleLevel"/>
     <w:tmpl w:val="166470C2"/>
@@ -9092,7 +9118,7 @@
       </w:rPr>
     </w:lvl>
   </w:abstractNum>
-  <w:abstractNum w:abstractNumId="16" w15:restartNumberingAfterBreak="0">
+  <w:abstractNum w:abstractNumId="17" w15:restartNumberingAfterBreak="0">
     <w:nsid w:val="709F53E7"/>
     <w:multiLevelType w:val="multilevel"/>
     <w:tmpl w:val="033421AC"/>
@@ -9178,7 +9204,7 @@
       </w:pPr>
     </w:lvl>
   </w:abstractNum>
-  <w:abstractNum w:abstractNumId="17" w15:restartNumberingAfterBreak="0">
+  <w:abstractNum w:abstractNumId="18" w15:restartNumberingAfterBreak="0">
     <w:nsid w:val="791E393A"/>
     <w:multiLevelType w:val="multilevel"/>
     <w:tmpl w:val="280842C4"/>
@@ -9295,37 +9321,37 @@
     <w:abstractNumId w:val="3"/>
   </w:num>
   <w:num w:numId="2" w16cid:durableId="772238952">
-    <w:abstractNumId w:val="14"/>
+    <w:abstractNumId w:val="15"/>
   </w:num>
   <w:num w:numId="3" w16cid:durableId="1808357885">
     <w:abstractNumId w:val="2"/>
   </w:num>
   <w:num w:numId="4" w16cid:durableId="490562558">
-    <w:abstractNumId w:val="9"/>
+    <w:abstractNumId w:val="10"/>
   </w:num>
   <w:num w:numId="5" w16cid:durableId="398089560">
-    <w:abstractNumId w:val="15"/>
+    <w:abstractNumId w:val="16"/>
   </w:num>
   <w:num w:numId="6" w16cid:durableId="756101525">
-    <w:abstractNumId w:val="6"/>
+    <w:abstractNumId w:val="7"/>
   </w:num>
   <w:num w:numId="7" w16cid:durableId="291255762">
     <w:abstractNumId w:val="0"/>
   </w:num>
   <w:num w:numId="8" w16cid:durableId="138546743">
-    <w:abstractNumId w:val="7"/>
+    <w:abstractNumId w:val="8"/>
   </w:num>
   <w:num w:numId="9" w16cid:durableId="1612011826">
-    <w:abstractNumId w:val="10"/>
+    <w:abstractNumId w:val="11"/>
   </w:num>
   <w:num w:numId="10" w16cid:durableId="301817050">
-    <w:abstractNumId w:val="12"/>
+    <w:abstractNumId w:val="13"/>
   </w:num>
   <w:num w:numId="11" w16cid:durableId="935986958">
-    <w:abstractNumId w:val="8"/>
+    <w:abstractNumId w:val="9"/>
   </w:num>
   <w:num w:numId="12" w16cid:durableId="1780278">
-    <w:abstractNumId w:val="5"/>
+    <w:abstractNumId w:val="6"/>
   </w:num>
   <w:num w:numId="13" w16cid:durableId="1749573360">
     <w:abstractNumId w:val="0"/>
@@ -9388,13 +9414,13 @@
     </w:lvlOverride>
   </w:num>
   <w:num w:numId="15" w16cid:durableId="180555823">
-    <w:abstractNumId w:val="16"/>
+    <w:abstractNumId w:val="17"/>
   </w:num>
   <w:num w:numId="16" w16cid:durableId="337391075">
-    <w:abstractNumId w:val="13"/>
+    <w:abstractNumId w:val="14"/>
   </w:num>
   <w:num w:numId="17" w16cid:durableId="1449395871">
-    <w:abstractNumId w:val="17"/>
+    <w:abstractNumId w:val="18"/>
   </w:num>
   <w:num w:numId="18" w16cid:durableId="683358738">
     <w:abstractNumId w:val="1"/>
@@ -9403,10 +9429,13 @@
     <w:abstractNumId w:val="4"/>
   </w:num>
   <w:num w:numId="20" w16cid:durableId="1277247997">
-    <w:abstractNumId w:val="11"/>
+    <w:abstractNumId w:val="12"/>
   </w:num>
   <w:num w:numId="21" w16cid:durableId="215507161">
     <w:abstractNumId w:val="0"/>
+  </w:num>
+  <w:num w:numId="22" w16cid:durableId="1094593829">
+    <w:abstractNumId w:val="5"/>
   </w:num>
   <w:numIdMacAtCleanup w:val="11"/>
 </w:numbering>
@@ -9942,7 +9971,6 @@
   <w:style w:type="character" w:default="1" w:styleId="DefaultParagraphFont">
     <w:name w:val="Default Paragraph Font"/>
     <w:uiPriority w:val="1"/>
-    <w:semiHidden/>
     <w:unhideWhenUsed/>
   </w:style>
   <w:style w:type="table" w:default="1" w:styleId="TableNormal">

</xml_diff>